<commit_message>
atualização da aula dia 13/10/2026
</commit_message>
<xml_diff>
--- a/apostila/Apostila Space For Men.docx
+++ b/apostila/Apostila Space For Men.docx
@@ -18898,8 +18898,2611 @@
           <w:szCs w:val="24"/>
         </w:rPr>
       </w:pPr>
+      <w:r>
+        <w:rPr>
+          <w:sz w:val="24"/>
+          <w:szCs w:val="24"/>
+        </w:rPr>
+        <w:t xml:space="preserve">87 – Adicionando ícones </w:t>
+      </w:r>
+      <w:r>
+        <w:rPr>
+          <w:sz w:val="24"/>
+          <w:szCs w:val="24"/>
+        </w:rPr>
+        <w:t xml:space="preserve">a minha </w:t>
+      </w:r>
+      <w:r>
+        <w:rPr>
+          <w:sz w:val="24"/>
+          <w:szCs w:val="24"/>
+        </w:rPr>
+        <w:t>página</w:t>
+      </w:r>
+      <w:r>
+        <w:rPr>
+          <w:sz w:val="24"/>
+          <w:szCs w:val="24"/>
+        </w:rPr>
+        <w:t xml:space="preserve"> conforme código.</w:t>
+      </w:r>
+    </w:p>
+    <w:p>
+      <w:pPr>
+        <w:pStyle w:val="PargrafodaLista"/>
+        <w:tabs>
+          <w:tab w:val="left" w:pos="1275"/>
+        </w:tabs>
+        <w:rPr>
+          <w:sz w:val="24"/>
+          <w:szCs w:val="24"/>
+        </w:rPr>
+      </w:pPr>
+      <w:r>
+        <w:rPr>
+          <w:sz w:val="24"/>
+          <w:szCs w:val="24"/>
+        </w:rPr>
+        <w:t xml:space="preserve">Acessando o site de Unicode através </w:t>
+      </w:r>
+      <w:proofErr w:type="spellStart"/>
+      <w:r>
+        <w:rPr>
+          <w:sz w:val="24"/>
+          <w:szCs w:val="24"/>
+        </w:rPr>
+        <w:t>google</w:t>
+      </w:r>
+      <w:proofErr w:type="spellEnd"/>
+      <w:r>
+        <w:rPr>
+          <w:sz w:val="24"/>
+          <w:szCs w:val="24"/>
+        </w:rPr>
+        <w:t xml:space="preserve"> </w:t>
+      </w:r>
+    </w:p>
+    <w:p>
+      <w:pPr>
+        <w:pStyle w:val="PargrafodaLista"/>
+        <w:tabs>
+          <w:tab w:val="left" w:pos="1275"/>
+        </w:tabs>
+        <w:rPr>
+          <w:sz w:val="24"/>
+          <w:szCs w:val="24"/>
+        </w:rPr>
+      </w:pPr>
+      <w:r>
+        <w:rPr>
+          <w:noProof/>
+          <w:sz w:val="24"/>
+          <w:szCs w:val="24"/>
+        </w:rPr>
+        <w:drawing>
+          <wp:inline distT="0" distB="0" distL="0" distR="0" wp14:anchorId="26E6B5D5" wp14:editId="6A46BB5D">
+            <wp:extent cx="5400040" cy="3151505"/>
+            <wp:effectExtent l="0" t="0" r="0" b="0"/>
+            <wp:docPr id="167" name="Imagem 167"/>
+            <wp:cNvGraphicFramePr>
+              <a:graphicFrameLocks xmlns:a="http://schemas.openxmlformats.org/drawingml/2006/main" noChangeAspect="1"/>
+            </wp:cNvGraphicFramePr>
+            <a:graphic xmlns:a="http://schemas.openxmlformats.org/drawingml/2006/main">
+              <a:graphicData uri="http://schemas.openxmlformats.org/drawingml/2006/picture">
+                <pic:pic xmlns:pic="http://schemas.openxmlformats.org/drawingml/2006/picture">
+                  <pic:nvPicPr>
+                    <pic:cNvPr id="1" name=""/>
+                    <pic:cNvPicPr/>
+                  </pic:nvPicPr>
+                  <pic:blipFill>
+                    <a:blip r:embed="rId132"/>
+                    <a:stretch>
+                      <a:fillRect/>
+                    </a:stretch>
+                  </pic:blipFill>
+                  <pic:spPr>
+                    <a:xfrm>
+                      <a:off x="0" y="0"/>
+                      <a:ext cx="5400040" cy="3151505"/>
+                    </a:xfrm>
+                    <a:prstGeom prst="rect">
+                      <a:avLst/>
+                    </a:prstGeom>
+                  </pic:spPr>
+                </pic:pic>
+              </a:graphicData>
+            </a:graphic>
+          </wp:inline>
+        </w:drawing>
+      </w:r>
+    </w:p>
+    <w:p>
+      <w:pPr>
+        <w:pStyle w:val="PargrafodaLista"/>
+        <w:tabs>
+          <w:tab w:val="left" w:pos="1275"/>
+        </w:tabs>
+        <w:rPr>
+          <w:sz w:val="24"/>
+          <w:szCs w:val="24"/>
+        </w:rPr>
+      </w:pPr>
+    </w:p>
+    <w:p>
+      <w:pPr>
+        <w:pStyle w:val="PargrafodaLista"/>
+        <w:tabs>
+          <w:tab w:val="left" w:pos="1275"/>
+        </w:tabs>
+        <w:rPr>
+          <w:sz w:val="24"/>
+          <w:szCs w:val="24"/>
+        </w:rPr>
+      </w:pPr>
+      <w:r>
+        <w:rPr>
+          <w:sz w:val="24"/>
+          <w:szCs w:val="24"/>
+        </w:rPr>
+        <w:t>Copiamos a estrela e colamos no código.</w:t>
+      </w:r>
+    </w:p>
+    <w:p>
+      <w:pPr>
+        <w:pStyle w:val="PargrafodaLista"/>
+        <w:tabs>
+          <w:tab w:val="left" w:pos="1275"/>
+        </w:tabs>
+        <w:rPr>
+          <w:sz w:val="24"/>
+          <w:szCs w:val="24"/>
+        </w:rPr>
+      </w:pPr>
+      <w:r>
+        <w:rPr>
+          <w:noProof/>
+          <w:sz w:val="24"/>
+          <w:szCs w:val="24"/>
+        </w:rPr>
+        <w:drawing>
+          <wp:inline distT="0" distB="0" distL="0" distR="0" wp14:anchorId="1AC3E35C" wp14:editId="6144541B">
+            <wp:extent cx="2309238" cy="875080"/>
+            <wp:effectExtent l="0" t="0" r="0" b="1270"/>
+            <wp:docPr id="165" name="Imagem 165"/>
+            <wp:cNvGraphicFramePr>
+              <a:graphicFrameLocks xmlns:a="http://schemas.openxmlformats.org/drawingml/2006/main" noChangeAspect="1"/>
+            </wp:cNvGraphicFramePr>
+            <a:graphic xmlns:a="http://schemas.openxmlformats.org/drawingml/2006/main">
+              <a:graphicData uri="http://schemas.openxmlformats.org/drawingml/2006/picture">
+                <pic:pic xmlns:pic="http://schemas.openxmlformats.org/drawingml/2006/picture">
+                  <pic:nvPicPr>
+                    <pic:cNvPr id="1" name=""/>
+                    <pic:cNvPicPr/>
+                  </pic:nvPicPr>
+                  <pic:blipFill>
+                    <a:blip r:embed="rId133"/>
+                    <a:stretch>
+                      <a:fillRect/>
+                    </a:stretch>
+                  </pic:blipFill>
+                  <pic:spPr>
+                    <a:xfrm>
+                      <a:off x="0" y="0"/>
+                      <a:ext cx="2327315" cy="881930"/>
+                    </a:xfrm>
+                    <a:prstGeom prst="rect">
+                      <a:avLst/>
+                    </a:prstGeom>
+                  </pic:spPr>
+                </pic:pic>
+              </a:graphicData>
+            </a:graphic>
+          </wp:inline>
+        </w:drawing>
+      </w:r>
+    </w:p>
+    <w:p>
+      <w:pPr>
+        <w:pStyle w:val="PargrafodaLista"/>
+        <w:tabs>
+          <w:tab w:val="left" w:pos="1275"/>
+        </w:tabs>
+        <w:rPr>
+          <w:sz w:val="24"/>
+          <w:szCs w:val="24"/>
+        </w:rPr>
+      </w:pPr>
+      <w:r>
+        <w:rPr>
+          <w:noProof/>
+          <w:sz w:val="24"/>
+          <w:szCs w:val="24"/>
+        </w:rPr>
+        <w:lastRenderedPageBreak/>
+        <w:drawing>
+          <wp:inline distT="0" distB="0" distL="0" distR="0" wp14:anchorId="1CB53DA0" wp14:editId="7009F000">
+            <wp:extent cx="3405825" cy="1349274"/>
+            <wp:effectExtent l="0" t="0" r="4445" b="3810"/>
+            <wp:docPr id="166" name="Imagem 166"/>
+            <wp:cNvGraphicFramePr>
+              <a:graphicFrameLocks xmlns:a="http://schemas.openxmlformats.org/drawingml/2006/main" noChangeAspect="1"/>
+            </wp:cNvGraphicFramePr>
+            <a:graphic xmlns:a="http://schemas.openxmlformats.org/drawingml/2006/main">
+              <a:graphicData uri="http://schemas.openxmlformats.org/drawingml/2006/picture">
+                <pic:pic xmlns:pic="http://schemas.openxmlformats.org/drawingml/2006/picture">
+                  <pic:nvPicPr>
+                    <pic:cNvPr id="1" name=""/>
+                    <pic:cNvPicPr/>
+                  </pic:nvPicPr>
+                  <pic:blipFill>
+                    <a:blip r:embed="rId134"/>
+                    <a:stretch>
+                      <a:fillRect/>
+                    </a:stretch>
+                  </pic:blipFill>
+                  <pic:spPr>
+                    <a:xfrm>
+                      <a:off x="0" y="0"/>
+                      <a:ext cx="3420461" cy="1355072"/>
+                    </a:xfrm>
+                    <a:prstGeom prst="rect">
+                      <a:avLst/>
+                    </a:prstGeom>
+                  </pic:spPr>
+                </pic:pic>
+              </a:graphicData>
+            </a:graphic>
+          </wp:inline>
+        </w:drawing>
+      </w:r>
+    </w:p>
+    <w:p>
+      <w:pPr>
+        <w:pStyle w:val="PargrafodaLista"/>
+        <w:tabs>
+          <w:tab w:val="left" w:pos="1275"/>
+        </w:tabs>
+        <w:rPr>
+          <w:sz w:val="24"/>
+          <w:szCs w:val="24"/>
+        </w:rPr>
+      </w:pPr>
+    </w:p>
+    <w:p>
+      <w:pPr>
+        <w:pStyle w:val="PargrafodaLista"/>
+        <w:tabs>
+          <w:tab w:val="left" w:pos="1275"/>
+        </w:tabs>
+        <w:rPr>
+          <w:sz w:val="24"/>
+          <w:szCs w:val="24"/>
+        </w:rPr>
+      </w:pPr>
+      <w:r>
+        <w:rPr>
+          <w:sz w:val="24"/>
+          <w:szCs w:val="24"/>
+        </w:rPr>
+        <w:t xml:space="preserve">88- </w:t>
+      </w:r>
+      <w:r>
+        <w:rPr>
+          <w:sz w:val="24"/>
+          <w:szCs w:val="24"/>
+        </w:rPr>
+        <w:t>Queremos que o primeiro item da minha lista fica em negrito.</w:t>
+      </w:r>
+    </w:p>
+    <w:p>
+      <w:pPr>
+        <w:pStyle w:val="PargrafodaLista"/>
+        <w:tabs>
+          <w:tab w:val="left" w:pos="1275"/>
+        </w:tabs>
+        <w:rPr>
+          <w:sz w:val="24"/>
+          <w:szCs w:val="24"/>
+        </w:rPr>
+      </w:pPr>
+      <w:r>
+        <w:rPr>
+          <w:noProof/>
+          <w:sz w:val="24"/>
+          <w:szCs w:val="24"/>
+        </w:rPr>
+        <mc:AlternateContent>
+          <mc:Choice Requires="wps">
+            <w:drawing>
+              <wp:anchor distT="0" distB="0" distL="114300" distR="114300" simplePos="0" relativeHeight="251703296" behindDoc="0" locked="0" layoutInCell="1" allowOverlap="1">
+                <wp:simplePos x="0" y="0"/>
+                <wp:positionH relativeFrom="column">
+                  <wp:posOffset>2226335</wp:posOffset>
+                </wp:positionH>
+                <wp:positionV relativeFrom="paragraph">
+                  <wp:posOffset>235229</wp:posOffset>
+                </wp:positionV>
+                <wp:extent cx="1236269" cy="724205"/>
+                <wp:effectExtent l="38100" t="38100" r="21590" b="19050"/>
+                <wp:wrapNone/>
+                <wp:docPr id="170" name="Conector de Seta Reta 170"/>
+                <wp:cNvGraphicFramePr/>
+                <a:graphic xmlns:a="http://schemas.openxmlformats.org/drawingml/2006/main">
+                  <a:graphicData uri="http://schemas.microsoft.com/office/word/2010/wordprocessingShape">
+                    <wps:wsp>
+                      <wps:cNvCnPr/>
+                      <wps:spPr>
+                        <a:xfrm flipH="1" flipV="1">
+                          <a:off x="0" y="0"/>
+                          <a:ext cx="1236269" cy="724205"/>
+                        </a:xfrm>
+                        <a:prstGeom prst="straightConnector1">
+                          <a:avLst/>
+                        </a:prstGeom>
+                        <a:ln>
+                          <a:tailEnd type="triangle"/>
+                        </a:ln>
+                      </wps:spPr>
+                      <wps:style>
+                        <a:lnRef idx="1">
+                          <a:schemeClr val="accent1"/>
+                        </a:lnRef>
+                        <a:fillRef idx="0">
+                          <a:schemeClr val="accent1"/>
+                        </a:fillRef>
+                        <a:effectRef idx="0">
+                          <a:schemeClr val="accent1"/>
+                        </a:effectRef>
+                        <a:fontRef idx="minor">
+                          <a:schemeClr val="tx1"/>
+                        </a:fontRef>
+                      </wps:style>
+                      <wps:bodyPr/>
+                    </wps:wsp>
+                  </a:graphicData>
+                </a:graphic>
+              </wp:anchor>
+            </w:drawing>
+          </mc:Choice>
+          <mc:Fallback>
+            <w:pict>
+              <v:shapetype w14:anchorId="21EFA390" id="_x0000_t32" coordsize="21600,21600" o:spt="32" o:oned="t" path="m,l21600,21600e" filled="f">
+                <v:path arrowok="t" fillok="f" o:connecttype="none"/>
+                <o:lock v:ext="edit" shapetype="t"/>
+              </v:shapetype>
+              <v:shape id="Conector de Seta Reta 170" o:spid="_x0000_s1026" type="#_x0000_t32" style="position:absolute;margin-left:175.3pt;margin-top:18.5pt;width:97.35pt;height:57pt;flip:x y;z-index:251703296;visibility:visible;mso-wrap-style:square;mso-wrap-distance-left:9pt;mso-wrap-distance-top:0;mso-wrap-distance-right:9pt;mso-wrap-distance-bottom:0;mso-position-horizontal:absolute;mso-position-horizontal-relative:text;mso-position-vertical:absolute;mso-position-vertical-relative:text" o:gfxdata="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" strokecolor="#4472c4 [3204]" strokeweight=".5pt">
+                <v:stroke endarrow="block" joinstyle="miter"/>
+              </v:shape>
+            </w:pict>
+          </mc:Fallback>
+        </mc:AlternateContent>
+      </w:r>
+      <w:r>
+        <w:rPr>
+          <w:noProof/>
+          <w:sz w:val="24"/>
+          <w:szCs w:val="24"/>
+        </w:rPr>
+        <w:drawing>
+          <wp:inline distT="0" distB="0" distL="0" distR="0" wp14:anchorId="7EA2D62B" wp14:editId="47FF2136">
+            <wp:extent cx="1901190" cy="1522729"/>
+            <wp:effectExtent l="0" t="0" r="3810" b="1905"/>
+            <wp:docPr id="169" name="Imagem 169"/>
+            <wp:cNvGraphicFramePr>
+              <a:graphicFrameLocks xmlns:a="http://schemas.openxmlformats.org/drawingml/2006/main" noChangeAspect="1"/>
+            </wp:cNvGraphicFramePr>
+            <a:graphic xmlns:a="http://schemas.openxmlformats.org/drawingml/2006/main">
+              <a:graphicData uri="http://schemas.openxmlformats.org/drawingml/2006/picture">
+                <pic:pic xmlns:pic="http://schemas.openxmlformats.org/drawingml/2006/picture">
+                  <pic:nvPicPr>
+                    <pic:cNvPr id="1" name=""/>
+                    <pic:cNvPicPr/>
+                  </pic:nvPicPr>
+                  <pic:blipFill>
+                    <a:blip r:embed="rId135"/>
+                    <a:stretch>
+                      <a:fillRect/>
+                    </a:stretch>
+                  </pic:blipFill>
+                  <pic:spPr>
+                    <a:xfrm>
+                      <a:off x="0" y="0"/>
+                      <a:ext cx="1953419" cy="1564561"/>
+                    </a:xfrm>
+                    <a:prstGeom prst="rect">
+                      <a:avLst/>
+                    </a:prstGeom>
+                  </pic:spPr>
+                </pic:pic>
+              </a:graphicData>
+            </a:graphic>
+          </wp:inline>
+        </w:drawing>
+      </w:r>
+      <w:r>
+        <w:rPr>
+          <w:noProof/>
+          <w:sz w:val="24"/>
+          <w:szCs w:val="24"/>
+        </w:rPr>
+        <w:drawing>
+          <wp:inline distT="0" distB="0" distL="0" distR="0" wp14:anchorId="30EFB8E5" wp14:editId="7EC1E0B6">
+            <wp:extent cx="2128723" cy="580017"/>
+            <wp:effectExtent l="0" t="0" r="5080" b="0"/>
+            <wp:docPr id="168" name="Imagem 168"/>
+            <wp:cNvGraphicFramePr>
+              <a:graphicFrameLocks xmlns:a="http://schemas.openxmlformats.org/drawingml/2006/main" noChangeAspect="1"/>
+            </wp:cNvGraphicFramePr>
+            <a:graphic xmlns:a="http://schemas.openxmlformats.org/drawingml/2006/main">
+              <a:graphicData uri="http://schemas.openxmlformats.org/drawingml/2006/picture">
+                <pic:pic xmlns:pic="http://schemas.openxmlformats.org/drawingml/2006/picture">
+                  <pic:nvPicPr>
+                    <pic:cNvPr id="1" name=""/>
+                    <pic:cNvPicPr/>
+                  </pic:nvPicPr>
+                  <pic:blipFill>
+                    <a:blip r:embed="rId136"/>
+                    <a:stretch>
+                      <a:fillRect/>
+                    </a:stretch>
+                  </pic:blipFill>
+                  <pic:spPr>
+                    <a:xfrm>
+                      <a:off x="0" y="0"/>
+                      <a:ext cx="2169546" cy="591140"/>
+                    </a:xfrm>
+                    <a:prstGeom prst="rect">
+                      <a:avLst/>
+                    </a:prstGeom>
+                  </pic:spPr>
+                </pic:pic>
+              </a:graphicData>
+            </a:graphic>
+          </wp:inline>
+        </w:drawing>
+      </w:r>
+    </w:p>
+    <w:p>
+      <w:pPr>
+        <w:pStyle w:val="PargrafodaLista"/>
+        <w:tabs>
+          <w:tab w:val="left" w:pos="1275"/>
+        </w:tabs>
+        <w:rPr>
+          <w:sz w:val="24"/>
+          <w:szCs w:val="24"/>
+        </w:rPr>
+      </w:pPr>
+    </w:p>
+    <w:p>
+      <w:pPr>
+        <w:pStyle w:val="PargrafodaLista"/>
+        <w:tabs>
+          <w:tab w:val="left" w:pos="1275"/>
+        </w:tabs>
+        <w:rPr>
+          <w:sz w:val="24"/>
+          <w:szCs w:val="24"/>
+        </w:rPr>
+      </w:pPr>
+      <w:r>
+        <w:rPr>
+          <w:sz w:val="24"/>
+          <w:szCs w:val="24"/>
+        </w:rPr>
+        <w:t xml:space="preserve">89 </w:t>
+      </w:r>
+      <w:r>
+        <w:rPr>
+          <w:sz w:val="24"/>
+          <w:szCs w:val="24"/>
+        </w:rPr>
+        <w:t>–</w:t>
+      </w:r>
+      <w:r>
+        <w:rPr>
+          <w:sz w:val="24"/>
+          <w:szCs w:val="24"/>
+        </w:rPr>
+        <w:t xml:space="preserve"> Degrade</w:t>
+      </w:r>
+    </w:p>
+    <w:p>
+      <w:pPr>
+        <w:pStyle w:val="PargrafodaLista"/>
+        <w:tabs>
+          <w:tab w:val="left" w:pos="1275"/>
+        </w:tabs>
+        <w:rPr>
+          <w:sz w:val="24"/>
+          <w:szCs w:val="24"/>
+        </w:rPr>
+      </w:pPr>
+    </w:p>
+    <w:p>
+      <w:pPr>
+        <w:pStyle w:val="PargrafodaLista"/>
+        <w:tabs>
+          <w:tab w:val="left" w:pos="1275"/>
+        </w:tabs>
+        <w:rPr>
+          <w:sz w:val="24"/>
+          <w:szCs w:val="24"/>
+        </w:rPr>
+      </w:pPr>
+      <w:r>
+        <w:rPr>
+          <w:sz w:val="24"/>
+          <w:szCs w:val="24"/>
+        </w:rPr>
+        <w:t>O Degrade de cor e uma sequencia  de tons continuo, podendo ser limitado ou ilimitado. Ou seja</w:t>
+      </w:r>
+      <w:r>
+        <w:rPr>
+          <w:sz w:val="24"/>
+          <w:szCs w:val="24"/>
+        </w:rPr>
+        <w:t>, é a área onde duas ou mais cores são sobrepostas.</w:t>
+      </w:r>
+    </w:p>
+    <w:p>
+      <w:pPr>
+        <w:pStyle w:val="PargrafodaLista"/>
+        <w:tabs>
+          <w:tab w:val="left" w:pos="1275"/>
+        </w:tabs>
+        <w:rPr>
+          <w:sz w:val="24"/>
+          <w:szCs w:val="24"/>
+        </w:rPr>
+      </w:pPr>
+      <w:r>
+        <w:rPr>
+          <w:sz w:val="24"/>
+          <w:szCs w:val="24"/>
+        </w:rPr>
+        <w:t>Cada uma com suas intensidades formando uma transição suave entre as cores</w:t>
+      </w:r>
+      <w:r>
+        <w:rPr>
+          <w:sz w:val="24"/>
+          <w:szCs w:val="24"/>
+        </w:rPr>
+        <w:t>, no sentido de apresentar aspectos</w:t>
+      </w:r>
+      <w:r>
+        <w:rPr>
+          <w:sz w:val="24"/>
+          <w:szCs w:val="24"/>
+        </w:rPr>
+        <w:t>.</w:t>
+      </w:r>
+    </w:p>
+    <w:p>
+      <w:pPr>
+        <w:pStyle w:val="PargrafodaLista"/>
+        <w:tabs>
+          <w:tab w:val="left" w:pos="1275"/>
+        </w:tabs>
+        <w:rPr>
+          <w:sz w:val="24"/>
+          <w:szCs w:val="24"/>
+        </w:rPr>
+      </w:pPr>
+      <w:r>
+        <w:rPr>
+          <w:sz w:val="24"/>
+          <w:szCs w:val="24"/>
+        </w:rPr>
+        <w:t xml:space="preserve">Para degrade colocamos duas cores de fundo uma na </w:t>
+      </w:r>
+      <w:proofErr w:type="spellStart"/>
+      <w:r>
+        <w:rPr>
+          <w:sz w:val="24"/>
+          <w:szCs w:val="24"/>
+        </w:rPr>
+        <w:t>section</w:t>
+      </w:r>
+      <w:proofErr w:type="spellEnd"/>
+      <w:r>
+        <w:rPr>
+          <w:sz w:val="24"/>
+          <w:szCs w:val="24"/>
+        </w:rPr>
+        <w:t xml:space="preserve"> principal e outra na </w:t>
+      </w:r>
+      <w:proofErr w:type="spellStart"/>
+      <w:r>
+        <w:rPr>
+          <w:sz w:val="24"/>
+          <w:szCs w:val="24"/>
+        </w:rPr>
+        <w:t>section</w:t>
+      </w:r>
+      <w:proofErr w:type="spellEnd"/>
+      <w:r>
+        <w:rPr>
+          <w:sz w:val="24"/>
+          <w:szCs w:val="24"/>
+        </w:rPr>
+        <w:t xml:space="preserve"> benefícios.</w:t>
+      </w:r>
+    </w:p>
+    <w:p>
+      <w:pPr>
+        <w:pStyle w:val="PargrafodaLista"/>
+        <w:tabs>
+          <w:tab w:val="left" w:pos="1275"/>
+        </w:tabs>
+        <w:rPr>
+          <w:sz w:val="24"/>
+          <w:szCs w:val="24"/>
+        </w:rPr>
+      </w:pPr>
+    </w:p>
+    <w:p>
+      <w:pPr>
+        <w:pStyle w:val="PargrafodaLista"/>
+        <w:tabs>
+          <w:tab w:val="left" w:pos="1275"/>
+        </w:tabs>
+        <w:rPr>
+          <w:sz w:val="24"/>
+          <w:szCs w:val="24"/>
+        </w:rPr>
+      </w:pPr>
+      <w:r>
+        <w:rPr>
+          <w:noProof/>
+          <w:sz w:val="24"/>
+          <w:szCs w:val="24"/>
+        </w:rPr>
+        <w:drawing>
+          <wp:inline distT="0" distB="0" distL="0" distR="0" wp14:anchorId="39F3CD69" wp14:editId="1E6CD12A">
+            <wp:extent cx="4048690" cy="1390844"/>
+            <wp:effectExtent l="0" t="0" r="9525" b="0"/>
+            <wp:docPr id="171" name="Imagem 171"/>
+            <wp:cNvGraphicFramePr>
+              <a:graphicFrameLocks xmlns:a="http://schemas.openxmlformats.org/drawingml/2006/main" noChangeAspect="1"/>
+            </wp:cNvGraphicFramePr>
+            <a:graphic xmlns:a="http://schemas.openxmlformats.org/drawingml/2006/main">
+              <a:graphicData uri="http://schemas.openxmlformats.org/drawingml/2006/picture">
+                <pic:pic xmlns:pic="http://schemas.openxmlformats.org/drawingml/2006/picture">
+                  <pic:nvPicPr>
+                    <pic:cNvPr id="1" name=""/>
+                    <pic:cNvPicPr/>
+                  </pic:nvPicPr>
+                  <pic:blipFill>
+                    <a:blip r:embed="rId137"/>
+                    <a:stretch>
+                      <a:fillRect/>
+                    </a:stretch>
+                  </pic:blipFill>
+                  <pic:spPr>
+                    <a:xfrm>
+                      <a:off x="0" y="0"/>
+                      <a:ext cx="4048690" cy="1390844"/>
+                    </a:xfrm>
+                    <a:prstGeom prst="rect">
+                      <a:avLst/>
+                    </a:prstGeom>
+                  </pic:spPr>
+                </pic:pic>
+              </a:graphicData>
+            </a:graphic>
+          </wp:inline>
+        </w:drawing>
+      </w:r>
+    </w:p>
+    <w:p>
+      <w:pPr>
+        <w:pStyle w:val="PargrafodaLista"/>
+        <w:tabs>
+          <w:tab w:val="left" w:pos="1275"/>
+        </w:tabs>
+        <w:rPr>
+          <w:sz w:val="24"/>
+          <w:szCs w:val="24"/>
+        </w:rPr>
+      </w:pPr>
+    </w:p>
+    <w:p>
+      <w:pPr>
+        <w:pStyle w:val="PargrafodaLista"/>
+        <w:tabs>
+          <w:tab w:val="left" w:pos="1275"/>
+        </w:tabs>
+        <w:rPr>
+          <w:sz w:val="24"/>
+          <w:szCs w:val="24"/>
+        </w:rPr>
+      </w:pPr>
+      <w:r>
+        <w:rPr>
+          <w:noProof/>
+          <w:sz w:val="24"/>
+          <w:szCs w:val="24"/>
+        </w:rPr>
+        <w:drawing>
+          <wp:inline distT="0" distB="0" distL="0" distR="0" wp14:anchorId="7D244140" wp14:editId="521CCD48">
+            <wp:extent cx="4020111" cy="1409897"/>
+            <wp:effectExtent l="0" t="0" r="0" b="0"/>
+            <wp:docPr id="172" name="Imagem 172"/>
+            <wp:cNvGraphicFramePr>
+              <a:graphicFrameLocks xmlns:a="http://schemas.openxmlformats.org/drawingml/2006/main" noChangeAspect="1"/>
+            </wp:cNvGraphicFramePr>
+            <a:graphic xmlns:a="http://schemas.openxmlformats.org/drawingml/2006/main">
+              <a:graphicData uri="http://schemas.openxmlformats.org/drawingml/2006/picture">
+                <pic:pic xmlns:pic="http://schemas.openxmlformats.org/drawingml/2006/picture">
+                  <pic:nvPicPr>
+                    <pic:cNvPr id="1" name=""/>
+                    <pic:cNvPicPr/>
+                  </pic:nvPicPr>
+                  <pic:blipFill>
+                    <a:blip r:embed="rId138"/>
+                    <a:stretch>
+                      <a:fillRect/>
+                    </a:stretch>
+                  </pic:blipFill>
+                  <pic:spPr>
+                    <a:xfrm>
+                      <a:off x="0" y="0"/>
+                      <a:ext cx="4020111" cy="1409897"/>
+                    </a:xfrm>
+                    <a:prstGeom prst="rect">
+                      <a:avLst/>
+                    </a:prstGeom>
+                  </pic:spPr>
+                </pic:pic>
+              </a:graphicData>
+            </a:graphic>
+          </wp:inline>
+        </w:drawing>
+      </w:r>
+    </w:p>
+    <w:p>
+      <w:pPr>
+        <w:pStyle w:val="PargrafodaLista"/>
+        <w:tabs>
+          <w:tab w:val="left" w:pos="1275"/>
+        </w:tabs>
+        <w:rPr>
+          <w:sz w:val="24"/>
+          <w:szCs w:val="24"/>
+        </w:rPr>
+      </w:pPr>
+    </w:p>
+    <w:p>
+      <w:pPr>
+        <w:pStyle w:val="PargrafodaLista"/>
+        <w:tabs>
+          <w:tab w:val="left" w:pos="1275"/>
+        </w:tabs>
+        <w:rPr>
+          <w:sz w:val="24"/>
+          <w:szCs w:val="24"/>
+        </w:rPr>
+      </w:pPr>
+    </w:p>
+    <w:p>
+      <w:pPr>
+        <w:pStyle w:val="PargrafodaLista"/>
+        <w:tabs>
+          <w:tab w:val="left" w:pos="1275"/>
+        </w:tabs>
+        <w:rPr>
+          <w:sz w:val="24"/>
+          <w:szCs w:val="24"/>
+        </w:rPr>
+      </w:pPr>
+      <w:r>
+        <w:rPr>
+          <w:sz w:val="24"/>
+          <w:szCs w:val="24"/>
+        </w:rPr>
+        <w:lastRenderedPageBreak/>
+        <w:t xml:space="preserve">90 – Para fazer o degrade tiramos a configuração do </w:t>
+      </w:r>
+      <w:proofErr w:type="spellStart"/>
+      <w:r>
+        <w:rPr>
+          <w:sz w:val="24"/>
+          <w:szCs w:val="24"/>
+        </w:rPr>
+        <w:t>main</w:t>
+      </w:r>
+      <w:proofErr w:type="spellEnd"/>
+      <w:r>
+        <w:rPr>
+          <w:sz w:val="24"/>
+          <w:szCs w:val="24"/>
+        </w:rPr>
+        <w:t xml:space="preserve"> que era </w:t>
+      </w:r>
+      <w:proofErr w:type="spellStart"/>
+      <w:r>
+        <w:rPr>
+          <w:sz w:val="24"/>
+          <w:szCs w:val="24"/>
+        </w:rPr>
+        <w:t>width</w:t>
+      </w:r>
+      <w:proofErr w:type="spellEnd"/>
+      <w:r>
+        <w:rPr>
+          <w:sz w:val="24"/>
+          <w:szCs w:val="24"/>
+        </w:rPr>
+        <w:t xml:space="preserve">: 940px e </w:t>
+      </w:r>
+      <w:proofErr w:type="spellStart"/>
+      <w:r>
+        <w:rPr>
+          <w:sz w:val="24"/>
+          <w:szCs w:val="24"/>
+        </w:rPr>
+        <w:t>margin</w:t>
+      </w:r>
+      <w:proofErr w:type="spellEnd"/>
+      <w:r>
+        <w:rPr>
+          <w:sz w:val="24"/>
+          <w:szCs w:val="24"/>
+        </w:rPr>
+        <w:t xml:space="preserve">: 0 auto e colocamos na </w:t>
+      </w:r>
+      <w:proofErr w:type="spellStart"/>
+      <w:r>
+        <w:rPr>
+          <w:sz w:val="24"/>
+          <w:szCs w:val="24"/>
+        </w:rPr>
+        <w:t>section</w:t>
+      </w:r>
+      <w:proofErr w:type="spellEnd"/>
+      <w:r>
+        <w:rPr>
+          <w:sz w:val="24"/>
+          <w:szCs w:val="24"/>
+        </w:rPr>
+        <w:t xml:space="preserve"> principal e mapa. Assim a cor de fundo da </w:t>
+      </w:r>
+      <w:proofErr w:type="spellStart"/>
+      <w:r>
+        <w:rPr>
+          <w:sz w:val="24"/>
+          <w:szCs w:val="24"/>
+        </w:rPr>
+        <w:t>section</w:t>
+      </w:r>
+      <w:proofErr w:type="spellEnd"/>
+      <w:r>
+        <w:rPr>
+          <w:sz w:val="24"/>
+          <w:szCs w:val="24"/>
+        </w:rPr>
+        <w:t xml:space="preserve"> benefícios ocupou a largura toda.</w:t>
+      </w:r>
+    </w:p>
+    <w:p>
+      <w:pPr>
+        <w:pStyle w:val="PargrafodaLista"/>
+        <w:tabs>
+          <w:tab w:val="left" w:pos="1275"/>
+        </w:tabs>
+        <w:rPr>
+          <w:sz w:val="24"/>
+          <w:szCs w:val="24"/>
+        </w:rPr>
+      </w:pPr>
+      <w:r>
+        <w:rPr>
+          <w:noProof/>
+          <w:sz w:val="24"/>
+          <w:szCs w:val="24"/>
+        </w:rPr>
+        <w:drawing>
+          <wp:inline distT="0" distB="0" distL="0" distR="0" wp14:anchorId="353489E8" wp14:editId="4691F9E3">
+            <wp:extent cx="4810796" cy="1771897"/>
+            <wp:effectExtent l="0" t="0" r="8890" b="0"/>
+            <wp:docPr id="173" name="Imagem 173"/>
+            <wp:cNvGraphicFramePr>
+              <a:graphicFrameLocks xmlns:a="http://schemas.openxmlformats.org/drawingml/2006/main" noChangeAspect="1"/>
+            </wp:cNvGraphicFramePr>
+            <a:graphic xmlns:a="http://schemas.openxmlformats.org/drawingml/2006/main">
+              <a:graphicData uri="http://schemas.openxmlformats.org/drawingml/2006/picture">
+                <pic:pic xmlns:pic="http://schemas.openxmlformats.org/drawingml/2006/picture">
+                  <pic:nvPicPr>
+                    <pic:cNvPr id="1" name=""/>
+                    <pic:cNvPicPr/>
+                  </pic:nvPicPr>
+                  <pic:blipFill>
+                    <a:blip r:embed="rId139"/>
+                    <a:stretch>
+                      <a:fillRect/>
+                    </a:stretch>
+                  </pic:blipFill>
+                  <pic:spPr>
+                    <a:xfrm>
+                      <a:off x="0" y="0"/>
+                      <a:ext cx="4810796" cy="1771897"/>
+                    </a:xfrm>
+                    <a:prstGeom prst="rect">
+                      <a:avLst/>
+                    </a:prstGeom>
+                  </pic:spPr>
+                </pic:pic>
+              </a:graphicData>
+            </a:graphic>
+          </wp:inline>
+        </w:drawing>
+      </w:r>
+    </w:p>
+    <w:p>
+      <w:pPr>
+        <w:pStyle w:val="PargrafodaLista"/>
+        <w:tabs>
+          <w:tab w:val="left" w:pos="1275"/>
+        </w:tabs>
+        <w:rPr>
+          <w:sz w:val="24"/>
+          <w:szCs w:val="24"/>
+        </w:rPr>
+      </w:pPr>
+    </w:p>
+    <w:p>
+      <w:pPr>
+        <w:pStyle w:val="PargrafodaLista"/>
+        <w:tabs>
+          <w:tab w:val="left" w:pos="1275"/>
+        </w:tabs>
+        <w:rPr>
+          <w:sz w:val="24"/>
+          <w:szCs w:val="24"/>
+        </w:rPr>
+      </w:pPr>
+      <w:r>
+        <w:rPr>
+          <w:noProof/>
+          <w:sz w:val="24"/>
+          <w:szCs w:val="24"/>
+        </w:rPr>
+        <w:drawing>
+          <wp:inline distT="0" distB="0" distL="0" distR="0" wp14:anchorId="281230A0" wp14:editId="6EF3A6AA">
+            <wp:extent cx="3162741" cy="1495634"/>
+            <wp:effectExtent l="0" t="0" r="0" b="9525"/>
+            <wp:docPr id="174" name="Imagem 174"/>
+            <wp:cNvGraphicFramePr>
+              <a:graphicFrameLocks xmlns:a="http://schemas.openxmlformats.org/drawingml/2006/main" noChangeAspect="1"/>
+            </wp:cNvGraphicFramePr>
+            <a:graphic xmlns:a="http://schemas.openxmlformats.org/drawingml/2006/main">
+              <a:graphicData uri="http://schemas.openxmlformats.org/drawingml/2006/picture">
+                <pic:pic xmlns:pic="http://schemas.openxmlformats.org/drawingml/2006/picture">
+                  <pic:nvPicPr>
+                    <pic:cNvPr id="1" name=""/>
+                    <pic:cNvPicPr/>
+                  </pic:nvPicPr>
+                  <pic:blipFill>
+                    <a:blip r:embed="rId140"/>
+                    <a:stretch>
+                      <a:fillRect/>
+                    </a:stretch>
+                  </pic:blipFill>
+                  <pic:spPr>
+                    <a:xfrm>
+                      <a:off x="0" y="0"/>
+                      <a:ext cx="3162741" cy="1495634"/>
+                    </a:xfrm>
+                    <a:prstGeom prst="rect">
+                      <a:avLst/>
+                    </a:prstGeom>
+                  </pic:spPr>
+                </pic:pic>
+              </a:graphicData>
+            </a:graphic>
+          </wp:inline>
+        </w:drawing>
+      </w:r>
+    </w:p>
+    <w:p>
+      <w:pPr>
+        <w:pStyle w:val="PargrafodaLista"/>
+        <w:tabs>
+          <w:tab w:val="left" w:pos="1275"/>
+        </w:tabs>
+        <w:rPr>
+          <w:sz w:val="24"/>
+          <w:szCs w:val="24"/>
+        </w:rPr>
+      </w:pPr>
+    </w:p>
+    <w:p>
+      <w:pPr>
+        <w:pStyle w:val="PargrafodaLista"/>
+        <w:tabs>
+          <w:tab w:val="left" w:pos="1275"/>
+        </w:tabs>
+        <w:rPr>
+          <w:sz w:val="24"/>
+          <w:szCs w:val="24"/>
+        </w:rPr>
+      </w:pPr>
+    </w:p>
+    <w:p>
+      <w:pPr>
+        <w:pStyle w:val="PargrafodaLista"/>
+        <w:tabs>
+          <w:tab w:val="left" w:pos="1275"/>
+        </w:tabs>
+        <w:rPr>
+          <w:sz w:val="24"/>
+          <w:szCs w:val="24"/>
+        </w:rPr>
+      </w:pPr>
+      <w:r>
+        <w:rPr>
+          <w:sz w:val="24"/>
+          <w:szCs w:val="24"/>
+        </w:rPr>
+        <w:t xml:space="preserve">91 – E realizamos o código que </w:t>
+      </w:r>
+      <w:r>
+        <w:rPr>
+          <w:sz w:val="24"/>
+          <w:szCs w:val="24"/>
+        </w:rPr>
+        <w:t>irá</w:t>
+      </w:r>
+      <w:r>
+        <w:rPr>
+          <w:sz w:val="24"/>
+          <w:szCs w:val="24"/>
+        </w:rPr>
+        <w:t xml:space="preserve"> fazer o degrade na </w:t>
+      </w:r>
+      <w:proofErr w:type="spellStart"/>
+      <w:r>
+        <w:rPr>
+          <w:sz w:val="24"/>
+          <w:szCs w:val="24"/>
+        </w:rPr>
+        <w:t>section</w:t>
+      </w:r>
+      <w:proofErr w:type="spellEnd"/>
+      <w:r>
+        <w:rPr>
+          <w:sz w:val="24"/>
+          <w:szCs w:val="24"/>
+        </w:rPr>
+        <w:t xml:space="preserve"> mapa porque ela </w:t>
+      </w:r>
+      <w:r>
+        <w:rPr>
+          <w:sz w:val="24"/>
+          <w:szCs w:val="24"/>
+        </w:rPr>
+        <w:t>está</w:t>
+      </w:r>
+      <w:r>
+        <w:rPr>
+          <w:sz w:val="24"/>
+          <w:szCs w:val="24"/>
+        </w:rPr>
+        <w:t xml:space="preserve"> entr</w:t>
+      </w:r>
+      <w:r>
+        <w:rPr>
+          <w:sz w:val="24"/>
+          <w:szCs w:val="24"/>
+        </w:rPr>
+        <w:t>e</w:t>
+      </w:r>
+      <w:r>
+        <w:rPr>
+          <w:sz w:val="24"/>
+          <w:szCs w:val="24"/>
+        </w:rPr>
+        <w:t xml:space="preserve"> as duas se</w:t>
+      </w:r>
+      <w:r>
+        <w:rPr>
+          <w:sz w:val="24"/>
+          <w:szCs w:val="24"/>
+        </w:rPr>
+        <w:t>ssões que colocamos cor (.principal e .</w:t>
+      </w:r>
+      <w:proofErr w:type="spellStart"/>
+      <w:r>
+        <w:rPr>
+          <w:sz w:val="24"/>
+          <w:szCs w:val="24"/>
+        </w:rPr>
+        <w:t>beneficios</w:t>
+      </w:r>
+      <w:proofErr w:type="spellEnd"/>
+      <w:r>
+        <w:rPr>
+          <w:sz w:val="24"/>
+          <w:szCs w:val="24"/>
+        </w:rPr>
+        <w:t>)</w:t>
+      </w:r>
+    </w:p>
+    <w:p>
+      <w:pPr>
+        <w:pStyle w:val="PargrafodaLista"/>
+        <w:tabs>
+          <w:tab w:val="left" w:pos="1275"/>
+        </w:tabs>
+        <w:rPr>
+          <w:sz w:val="24"/>
+          <w:szCs w:val="24"/>
+        </w:rPr>
+      </w:pPr>
+      <w:r>
+        <w:rPr>
+          <w:sz w:val="24"/>
+          <w:szCs w:val="24"/>
+        </w:rPr>
+        <w:drawing>
+          <wp:inline distT="0" distB="0" distL="0" distR="0" wp14:anchorId="60F4CEFA" wp14:editId="2E642701">
+            <wp:extent cx="5400040" cy="1343660"/>
+            <wp:effectExtent l="0" t="0" r="0" b="8890"/>
+            <wp:docPr id="175" name="Imagem 175"/>
+            <wp:cNvGraphicFramePr>
+              <a:graphicFrameLocks xmlns:a="http://schemas.openxmlformats.org/drawingml/2006/main" noChangeAspect="1"/>
+            </wp:cNvGraphicFramePr>
+            <a:graphic xmlns:a="http://schemas.openxmlformats.org/drawingml/2006/main">
+              <a:graphicData uri="http://schemas.openxmlformats.org/drawingml/2006/picture">
+                <pic:pic xmlns:pic="http://schemas.openxmlformats.org/drawingml/2006/picture">
+                  <pic:nvPicPr>
+                    <pic:cNvPr id="1" name=""/>
+                    <pic:cNvPicPr/>
+                  </pic:nvPicPr>
+                  <pic:blipFill>
+                    <a:blip r:embed="rId141"/>
+                    <a:stretch>
+                      <a:fillRect/>
+                    </a:stretch>
+                  </pic:blipFill>
+                  <pic:spPr>
+                    <a:xfrm>
+                      <a:off x="0" y="0"/>
+                      <a:ext cx="5400040" cy="1343660"/>
+                    </a:xfrm>
+                    <a:prstGeom prst="rect">
+                      <a:avLst/>
+                    </a:prstGeom>
+                  </pic:spPr>
+                </pic:pic>
+              </a:graphicData>
+            </a:graphic>
+          </wp:inline>
+        </w:drawing>
+      </w:r>
+    </w:p>
+    <w:p>
+      <w:pPr>
+        <w:pStyle w:val="PargrafodaLista"/>
+        <w:tabs>
+          <w:tab w:val="left" w:pos="1275"/>
+        </w:tabs>
+        <w:rPr>
+          <w:sz w:val="24"/>
+          <w:szCs w:val="24"/>
+        </w:rPr>
+      </w:pPr>
+    </w:p>
+    <w:p>
+      <w:pPr>
+        <w:pStyle w:val="PargrafodaLista"/>
+        <w:tabs>
+          <w:tab w:val="left" w:pos="1275"/>
+        </w:tabs>
+        <w:rPr>
+          <w:sz w:val="24"/>
+          <w:szCs w:val="24"/>
+        </w:rPr>
+      </w:pPr>
+    </w:p>
+    <w:p>
+      <w:pPr>
+        <w:pStyle w:val="PargrafodaLista"/>
+        <w:tabs>
+          <w:tab w:val="left" w:pos="1275"/>
+        </w:tabs>
+        <w:rPr>
+          <w:sz w:val="24"/>
+          <w:szCs w:val="24"/>
+        </w:rPr>
+      </w:pPr>
+    </w:p>
+    <w:p>
+      <w:pPr>
+        <w:pStyle w:val="PargrafodaLista"/>
+        <w:tabs>
+          <w:tab w:val="left" w:pos="1275"/>
+        </w:tabs>
+        <w:rPr>
+          <w:sz w:val="24"/>
+          <w:szCs w:val="24"/>
+        </w:rPr>
+      </w:pPr>
+    </w:p>
+    <w:p>
+      <w:pPr>
+        <w:pStyle w:val="PargrafodaLista"/>
+        <w:tabs>
+          <w:tab w:val="left" w:pos="1275"/>
+        </w:tabs>
+        <w:rPr>
+          <w:sz w:val="24"/>
+          <w:szCs w:val="24"/>
+        </w:rPr>
+      </w:pPr>
+    </w:p>
+    <w:p>
+      <w:pPr>
+        <w:pStyle w:val="PargrafodaLista"/>
+        <w:tabs>
+          <w:tab w:val="left" w:pos="1275"/>
+        </w:tabs>
+        <w:rPr>
+          <w:sz w:val="24"/>
+          <w:szCs w:val="24"/>
+        </w:rPr>
+      </w:pPr>
+    </w:p>
+    <w:p>
+      <w:pPr>
+        <w:pStyle w:val="PargrafodaLista"/>
+        <w:tabs>
+          <w:tab w:val="left" w:pos="1275"/>
+        </w:tabs>
+        <w:rPr>
+          <w:sz w:val="24"/>
+          <w:szCs w:val="24"/>
+        </w:rPr>
+      </w:pPr>
+    </w:p>
+    <w:p>
+      <w:pPr>
+        <w:pStyle w:val="PargrafodaLista"/>
+        <w:tabs>
+          <w:tab w:val="left" w:pos="1275"/>
+        </w:tabs>
+        <w:rPr>
+          <w:sz w:val="24"/>
+          <w:szCs w:val="24"/>
+        </w:rPr>
+      </w:pPr>
+    </w:p>
+    <w:p>
+      <w:pPr>
+        <w:pStyle w:val="PargrafodaLista"/>
+        <w:tabs>
+          <w:tab w:val="left" w:pos="1275"/>
+        </w:tabs>
+        <w:rPr>
+          <w:sz w:val="24"/>
+          <w:szCs w:val="24"/>
+        </w:rPr>
+      </w:pPr>
+    </w:p>
+    <w:p>
+      <w:pPr>
+        <w:pStyle w:val="PargrafodaLista"/>
+        <w:tabs>
+          <w:tab w:val="left" w:pos="1275"/>
+        </w:tabs>
+        <w:rPr>
+          <w:sz w:val="24"/>
+          <w:szCs w:val="24"/>
+        </w:rPr>
+      </w:pPr>
+    </w:p>
+    <w:p>
+      <w:pPr>
+        <w:pStyle w:val="PargrafodaLista"/>
+        <w:tabs>
+          <w:tab w:val="left" w:pos="1275"/>
+        </w:tabs>
+        <w:rPr>
+          <w:sz w:val="24"/>
+          <w:szCs w:val="24"/>
+        </w:rPr>
+      </w:pPr>
+    </w:p>
+    <w:p>
+      <w:pPr>
+        <w:pStyle w:val="PargrafodaLista"/>
+        <w:tabs>
+          <w:tab w:val="left" w:pos="1275"/>
+        </w:tabs>
+        <w:rPr>
+          <w:sz w:val="24"/>
+          <w:szCs w:val="24"/>
+        </w:rPr>
+      </w:pPr>
+    </w:p>
+    <w:p>
+      <w:pPr>
+        <w:pStyle w:val="PargrafodaLista"/>
+        <w:tabs>
+          <w:tab w:val="left" w:pos="1275"/>
+        </w:tabs>
+        <w:rPr>
+          <w:sz w:val="24"/>
+          <w:szCs w:val="24"/>
+        </w:rPr>
+      </w:pPr>
+    </w:p>
+    <w:p>
+      <w:pPr>
+        <w:pStyle w:val="PargrafodaLista"/>
+        <w:tabs>
+          <w:tab w:val="left" w:pos="1275"/>
+        </w:tabs>
+        <w:rPr>
+          <w:sz w:val="24"/>
+          <w:szCs w:val="24"/>
+        </w:rPr>
+      </w:pPr>
+    </w:p>
+    <w:p>
+      <w:pPr>
+        <w:pStyle w:val="PargrafodaLista"/>
+        <w:tabs>
+          <w:tab w:val="left" w:pos="1275"/>
+        </w:tabs>
+        <w:rPr>
+          <w:sz w:val="24"/>
+          <w:szCs w:val="24"/>
+        </w:rPr>
+      </w:pPr>
+      <w:r>
+        <w:rPr>
+          <w:sz w:val="24"/>
+          <w:szCs w:val="24"/>
+        </w:rPr>
+        <w:t xml:space="preserve">92- Opacidade </w:t>
+      </w:r>
+    </w:p>
+    <w:p>
+      <w:pPr>
+        <w:pStyle w:val="PargrafodaLista"/>
+        <w:tabs>
+          <w:tab w:val="left" w:pos="1275"/>
+        </w:tabs>
+        <w:rPr>
+          <w:sz w:val="24"/>
+          <w:szCs w:val="24"/>
+        </w:rPr>
+      </w:pPr>
+    </w:p>
+    <w:p>
+      <w:pPr>
+        <w:pStyle w:val="PargrafodaLista"/>
+        <w:tabs>
+          <w:tab w:val="left" w:pos="1275"/>
+        </w:tabs>
+        <w:rPr>
+          <w:sz w:val="24"/>
+          <w:szCs w:val="24"/>
+        </w:rPr>
+      </w:pPr>
+      <w:r>
+        <w:rPr>
+          <w:sz w:val="24"/>
+          <w:szCs w:val="24"/>
+        </w:rPr>
+        <w:t>O que é opacidade?</w:t>
+      </w:r>
+    </w:p>
+    <w:p>
+      <w:pPr>
+        <w:pStyle w:val="PargrafodaLista"/>
+        <w:tabs>
+          <w:tab w:val="left" w:pos="1275"/>
+        </w:tabs>
+        <w:rPr>
+          <w:b/>
+          <w:sz w:val="24"/>
+          <w:szCs w:val="24"/>
+        </w:rPr>
+      </w:pPr>
+    </w:p>
+    <w:p>
+      <w:pPr>
+        <w:pStyle w:val="PargrafodaLista"/>
+        <w:tabs>
+          <w:tab w:val="left" w:pos="1275"/>
+        </w:tabs>
+        <w:rPr>
+          <w:sz w:val="24"/>
+          <w:szCs w:val="24"/>
+        </w:rPr>
+      </w:pPr>
+      <w:r>
+        <w:rPr>
+          <w:sz w:val="24"/>
+          <w:szCs w:val="24"/>
+        </w:rPr>
+        <w:t>É</w:t>
+      </w:r>
+      <w:r>
+        <w:rPr>
+          <w:sz w:val="24"/>
+          <w:szCs w:val="24"/>
+        </w:rPr>
+        <w:t xml:space="preserve"> uma camada </w:t>
+      </w:r>
+      <w:r>
+        <w:rPr>
+          <w:sz w:val="24"/>
+          <w:szCs w:val="24"/>
+        </w:rPr>
+        <w:t>a mais que coloca em cima do elemento</w:t>
+      </w:r>
+      <w:r>
+        <w:rPr>
+          <w:sz w:val="24"/>
+          <w:szCs w:val="24"/>
+        </w:rPr>
+        <w:t>.</w:t>
+      </w:r>
+    </w:p>
+    <w:p>
+      <w:pPr>
+        <w:pStyle w:val="PargrafodaLista"/>
+        <w:tabs>
+          <w:tab w:val="left" w:pos="1275"/>
+        </w:tabs>
+        <w:rPr>
+          <w:sz w:val="24"/>
+          <w:szCs w:val="24"/>
+        </w:rPr>
+      </w:pPr>
+      <w:r>
+        <w:rPr>
+          <w:sz w:val="24"/>
+          <w:szCs w:val="24"/>
+        </w:rPr>
+        <w:t xml:space="preserve">Essa camada ajuda a luz passar ou não como por exemplo um insulfilme de um carro que ao ser aplicado ajuda </w:t>
+      </w:r>
+      <w:r>
+        <w:rPr>
+          <w:sz w:val="24"/>
+          <w:szCs w:val="24"/>
+        </w:rPr>
+        <w:t>que a luz do lado de fora não passa completamente.</w:t>
+      </w:r>
+    </w:p>
+    <w:p>
+      <w:pPr>
+        <w:pStyle w:val="PargrafodaLista"/>
+        <w:tabs>
+          <w:tab w:val="left" w:pos="1275"/>
+        </w:tabs>
+        <w:rPr>
+          <w:sz w:val="24"/>
+          <w:szCs w:val="24"/>
+        </w:rPr>
+      </w:pPr>
+      <w:proofErr w:type="spellStart"/>
+      <w:r>
+        <w:rPr>
+          <w:sz w:val="24"/>
+          <w:szCs w:val="24"/>
+        </w:rPr>
+        <w:t>Opacity</w:t>
+      </w:r>
+      <w:proofErr w:type="spellEnd"/>
+      <w:r>
+        <w:rPr>
+          <w:sz w:val="24"/>
+          <w:szCs w:val="24"/>
+        </w:rPr>
+        <w:t xml:space="preserve"> vai de 1 a 0</w:t>
+      </w:r>
+    </w:p>
+    <w:p>
+      <w:pPr>
+        <w:pStyle w:val="PargrafodaLista"/>
+        <w:tabs>
+          <w:tab w:val="left" w:pos="1275"/>
+        </w:tabs>
+        <w:rPr>
+          <w:sz w:val="24"/>
+          <w:szCs w:val="24"/>
+        </w:rPr>
+      </w:pPr>
+    </w:p>
+    <w:p>
+      <w:pPr>
+        <w:pStyle w:val="PargrafodaLista"/>
+        <w:tabs>
+          <w:tab w:val="left" w:pos="1275"/>
+        </w:tabs>
+        <w:rPr>
+          <w:sz w:val="24"/>
+          <w:szCs w:val="24"/>
+        </w:rPr>
+      </w:pPr>
+      <w:r>
+        <w:rPr>
+          <w:sz w:val="24"/>
+          <w:szCs w:val="24"/>
+        </w:rPr>
+        <w:t>0 – Exibe nada</w:t>
+      </w:r>
+    </w:p>
+    <w:p>
+      <w:pPr>
+        <w:pStyle w:val="PargrafodaLista"/>
+        <w:numPr>
+          <w:ilvl w:val="0"/>
+          <w:numId w:val="5"/>
+        </w:numPr>
+        <w:tabs>
+          <w:tab w:val="left" w:pos="1275"/>
+        </w:tabs>
+        <w:rPr>
+          <w:sz w:val="24"/>
+          <w:szCs w:val="24"/>
+        </w:rPr>
+      </w:pPr>
+      <w:r>
+        <w:rPr>
+          <w:sz w:val="24"/>
+          <w:szCs w:val="24"/>
+        </w:rPr>
+        <w:t xml:space="preserve">Exibe </w:t>
+      </w:r>
+      <w:r>
+        <w:rPr>
+          <w:sz w:val="24"/>
+          <w:szCs w:val="24"/>
+        </w:rPr>
+        <w:t>o elemento inteiro.</w:t>
+      </w:r>
+    </w:p>
+    <w:p>
+      <w:pPr>
+        <w:pStyle w:val="PargrafodaLista"/>
+        <w:tabs>
+          <w:tab w:val="left" w:pos="1275"/>
+        </w:tabs>
+        <w:ind w:left="1080"/>
+        <w:rPr>
+          <w:sz w:val="24"/>
+          <w:szCs w:val="24"/>
+        </w:rPr>
+      </w:pPr>
+      <w:r>
+        <w:rPr>
+          <w:sz w:val="24"/>
+          <w:szCs w:val="24"/>
+        </w:rPr>
+        <w:drawing>
+          <wp:inline distT="0" distB="0" distL="0" distR="0" wp14:anchorId="4D47828E" wp14:editId="6D58943D">
+            <wp:extent cx="3105583" cy="2295845"/>
+            <wp:effectExtent l="0" t="0" r="0" b="9525"/>
+            <wp:docPr id="176" name="Imagem 176"/>
+            <wp:cNvGraphicFramePr>
+              <a:graphicFrameLocks xmlns:a="http://schemas.openxmlformats.org/drawingml/2006/main" noChangeAspect="1"/>
+            </wp:cNvGraphicFramePr>
+            <a:graphic xmlns:a="http://schemas.openxmlformats.org/drawingml/2006/main">
+              <a:graphicData uri="http://schemas.openxmlformats.org/drawingml/2006/picture">
+                <pic:pic xmlns:pic="http://schemas.openxmlformats.org/drawingml/2006/picture">
+                  <pic:nvPicPr>
+                    <pic:cNvPr id="1" name=""/>
+                    <pic:cNvPicPr/>
+                  </pic:nvPicPr>
+                  <pic:blipFill>
+                    <a:blip r:embed="rId142"/>
+                    <a:stretch>
+                      <a:fillRect/>
+                    </a:stretch>
+                  </pic:blipFill>
+                  <pic:spPr>
+                    <a:xfrm>
+                      <a:off x="0" y="0"/>
+                      <a:ext cx="3105583" cy="2295845"/>
+                    </a:xfrm>
+                    <a:prstGeom prst="rect">
+                      <a:avLst/>
+                    </a:prstGeom>
+                  </pic:spPr>
+                </pic:pic>
+              </a:graphicData>
+            </a:graphic>
+          </wp:inline>
+        </w:drawing>
+      </w:r>
+    </w:p>
+    <w:p>
+      <w:pPr>
+        <w:pStyle w:val="PargrafodaLista"/>
+        <w:tabs>
+          <w:tab w:val="left" w:pos="1275"/>
+        </w:tabs>
+        <w:ind w:left="1080"/>
+        <w:rPr>
+          <w:sz w:val="24"/>
+          <w:szCs w:val="24"/>
+        </w:rPr>
+      </w:pPr>
+    </w:p>
+    <w:p>
+      <w:pPr>
+        <w:pStyle w:val="PargrafodaLista"/>
+        <w:tabs>
+          <w:tab w:val="left" w:pos="1275"/>
+        </w:tabs>
+        <w:ind w:left="1080"/>
+        <w:rPr>
+          <w:sz w:val="24"/>
+          <w:szCs w:val="24"/>
+        </w:rPr>
+      </w:pPr>
+    </w:p>
+    <w:p>
+      <w:pPr>
+        <w:pStyle w:val="PargrafodaLista"/>
+        <w:tabs>
+          <w:tab w:val="left" w:pos="1275"/>
+        </w:tabs>
+        <w:ind w:left="1080"/>
+        <w:rPr>
+          <w:sz w:val="24"/>
+          <w:szCs w:val="24"/>
+        </w:rPr>
+      </w:pPr>
+      <w:r>
+        <w:rPr>
+          <w:sz w:val="24"/>
+          <w:szCs w:val="24"/>
+        </w:rPr>
+        <w:t xml:space="preserve">93- </w:t>
+      </w:r>
+      <w:r>
+        <w:rPr>
+          <w:sz w:val="24"/>
+          <w:szCs w:val="24"/>
+        </w:rPr>
+        <w:t>Sombra nos elementos</w:t>
+      </w:r>
+    </w:p>
+    <w:p>
+      <w:pPr>
+        <w:pStyle w:val="PargrafodaLista"/>
+        <w:tabs>
+          <w:tab w:val="left" w:pos="1275"/>
+        </w:tabs>
+        <w:ind w:left="1080"/>
+        <w:rPr>
+          <w:sz w:val="24"/>
+          <w:szCs w:val="24"/>
+        </w:rPr>
+      </w:pPr>
+    </w:p>
+    <w:p>
+      <w:pPr>
+        <w:pStyle w:val="PargrafodaLista"/>
+        <w:tabs>
+          <w:tab w:val="left" w:pos="1275"/>
+        </w:tabs>
+        <w:ind w:left="1080"/>
+        <w:rPr>
+          <w:sz w:val="24"/>
+          <w:szCs w:val="24"/>
+        </w:rPr>
+      </w:pPr>
+      <w:r>
+        <w:rPr>
+          <w:sz w:val="24"/>
+          <w:szCs w:val="24"/>
+        </w:rPr>
+        <w:t xml:space="preserve">Como funciona a sombra? </w:t>
+      </w:r>
+      <w:r>
+        <w:rPr>
+          <w:sz w:val="24"/>
+          <w:szCs w:val="24"/>
+        </w:rPr>
+        <w:t xml:space="preserve">E como </w:t>
+      </w:r>
+      <w:r>
+        <w:rPr>
+          <w:sz w:val="24"/>
+          <w:szCs w:val="24"/>
+        </w:rPr>
+        <w:t>se coloca</w:t>
+      </w:r>
+      <w:r>
+        <w:rPr>
+          <w:sz w:val="24"/>
+          <w:szCs w:val="24"/>
+        </w:rPr>
+        <w:t xml:space="preserve"> um</w:t>
+      </w:r>
+      <w:r>
+        <w:rPr>
+          <w:sz w:val="24"/>
+          <w:szCs w:val="24"/>
+        </w:rPr>
+        <w:t>a</w:t>
+      </w:r>
+      <w:r>
+        <w:rPr>
+          <w:sz w:val="24"/>
+          <w:szCs w:val="24"/>
+        </w:rPr>
+        <w:t xml:space="preserve"> luz em cima do elemento que vai refletir a sombra </w:t>
+      </w:r>
+      <w:r>
+        <w:rPr>
+          <w:sz w:val="24"/>
+          <w:szCs w:val="24"/>
+        </w:rPr>
+        <w:t>em baixo.</w:t>
+      </w:r>
+    </w:p>
+    <w:p>
+      <w:pPr>
+        <w:pStyle w:val="PargrafodaLista"/>
+        <w:tabs>
+          <w:tab w:val="left" w:pos="1275"/>
+        </w:tabs>
+        <w:ind w:left="1080"/>
+        <w:rPr>
+          <w:sz w:val="24"/>
+          <w:szCs w:val="24"/>
+        </w:rPr>
+      </w:pPr>
+      <w:r>
+        <w:rPr>
+          <w:sz w:val="24"/>
+          <w:szCs w:val="24"/>
+        </w:rPr>
+        <w:t xml:space="preserve">Na </w:t>
+      </w:r>
+      <w:proofErr w:type="spellStart"/>
+      <w:r>
+        <w:rPr>
+          <w:sz w:val="24"/>
+          <w:szCs w:val="24"/>
+        </w:rPr>
+        <w:t>class</w:t>
+      </w:r>
+      <w:proofErr w:type="spellEnd"/>
+      <w:r>
+        <w:rPr>
+          <w:sz w:val="24"/>
+          <w:szCs w:val="24"/>
+        </w:rPr>
+        <w:t xml:space="preserve"> </w:t>
+      </w:r>
+      <w:proofErr w:type="spellStart"/>
+      <w:r>
+        <w:rPr>
+          <w:sz w:val="24"/>
+          <w:szCs w:val="24"/>
+        </w:rPr>
+        <w:t>imagembeneficios</w:t>
+      </w:r>
+      <w:proofErr w:type="spellEnd"/>
+      <w:r>
+        <w:rPr>
+          <w:sz w:val="24"/>
+          <w:szCs w:val="24"/>
+        </w:rPr>
+        <w:t xml:space="preserve"> </w:t>
+      </w:r>
+      <w:r>
+        <w:rPr>
+          <w:sz w:val="24"/>
+          <w:szCs w:val="24"/>
+        </w:rPr>
+        <w:t>vamos colocar box-</w:t>
+      </w:r>
+      <w:proofErr w:type="spellStart"/>
+      <w:r>
+        <w:rPr>
+          <w:sz w:val="24"/>
+          <w:szCs w:val="24"/>
+        </w:rPr>
+        <w:t>shadow</w:t>
+      </w:r>
+      <w:proofErr w:type="spellEnd"/>
+      <w:r>
+        <w:rPr>
+          <w:sz w:val="24"/>
+          <w:szCs w:val="24"/>
+        </w:rPr>
+        <w:t xml:space="preserve"> que significa sombra em caixa que possui eixo x e y .</w:t>
+      </w:r>
+    </w:p>
+    <w:p>
+      <w:pPr>
+        <w:pStyle w:val="PargrafodaLista"/>
+        <w:tabs>
+          <w:tab w:val="left" w:pos="1275"/>
+        </w:tabs>
+        <w:ind w:left="1080"/>
+        <w:rPr>
+          <w:sz w:val="24"/>
+          <w:szCs w:val="24"/>
+        </w:rPr>
+      </w:pPr>
+    </w:p>
+    <w:p>
+      <w:pPr>
+        <w:pStyle w:val="PargrafodaLista"/>
+        <w:tabs>
+          <w:tab w:val="left" w:pos="1275"/>
+        </w:tabs>
+        <w:rPr>
+          <w:sz w:val="24"/>
+          <w:szCs w:val="24"/>
+        </w:rPr>
+      </w:pPr>
+      <w:r>
+        <w:rPr>
+          <w:noProof/>
+          <w:sz w:val="24"/>
+          <w:szCs w:val="24"/>
+        </w:rPr>
+        <mc:AlternateContent>
+          <mc:Choice Requires="wps">
+            <w:drawing>
+              <wp:anchor distT="0" distB="0" distL="114300" distR="114300" simplePos="0" relativeHeight="251704320" behindDoc="0" locked="0" layoutInCell="1" allowOverlap="1">
+                <wp:simplePos x="0" y="0"/>
+                <wp:positionH relativeFrom="column">
+                  <wp:posOffset>4012565</wp:posOffset>
+                </wp:positionH>
+                <wp:positionV relativeFrom="paragraph">
+                  <wp:posOffset>34290</wp:posOffset>
+                </wp:positionV>
+                <wp:extent cx="908050" cy="800100"/>
+                <wp:effectExtent l="38100" t="0" r="25400" b="57150"/>
+                <wp:wrapNone/>
+                <wp:docPr id="179" name="Conector de Seta Reta 179"/>
+                <wp:cNvGraphicFramePr/>
+                <a:graphic xmlns:a="http://schemas.openxmlformats.org/drawingml/2006/main">
+                  <a:graphicData uri="http://schemas.microsoft.com/office/word/2010/wordprocessingShape">
+                    <wps:wsp>
+                      <wps:cNvCnPr/>
+                      <wps:spPr>
+                        <a:xfrm flipH="1">
+                          <a:off x="0" y="0"/>
+                          <a:ext cx="908050" cy="800100"/>
+                        </a:xfrm>
+                        <a:prstGeom prst="straightConnector1">
+                          <a:avLst/>
+                        </a:prstGeom>
+                        <a:ln>
+                          <a:tailEnd type="triangle"/>
+                        </a:ln>
+                      </wps:spPr>
+                      <wps:style>
+                        <a:lnRef idx="1">
+                          <a:schemeClr val="accent1"/>
+                        </a:lnRef>
+                        <a:fillRef idx="0">
+                          <a:schemeClr val="accent1"/>
+                        </a:fillRef>
+                        <a:effectRef idx="0">
+                          <a:schemeClr val="accent1"/>
+                        </a:effectRef>
+                        <a:fontRef idx="minor">
+                          <a:schemeClr val="tx1"/>
+                        </a:fontRef>
+                      </wps:style>
+                      <wps:bodyPr/>
+                    </wps:wsp>
+                  </a:graphicData>
+                </a:graphic>
+              </wp:anchor>
+            </w:drawing>
+          </mc:Choice>
+          <mc:Fallback>
+            <w:pict>
+              <v:shapetype w14:anchorId="6E7AC8C0" id="_x0000_t32" coordsize="21600,21600" o:spt="32" o:oned="t" path="m,l21600,21600e" filled="f">
+                <v:path arrowok="t" fillok="f" o:connecttype="none"/>
+                <o:lock v:ext="edit" shapetype="t"/>
+              </v:shapetype>
+              <v:shape id="Conector de Seta Reta 179" o:spid="_x0000_s1026" type="#_x0000_t32" style="position:absolute;margin-left:315.95pt;margin-top:2.7pt;width:71.5pt;height:63pt;flip:x;z-index:251704320;visibility:visible;mso-wrap-style:square;mso-wrap-distance-left:9pt;mso-wrap-distance-top:0;mso-wrap-distance-right:9pt;mso-wrap-distance-bottom:0;mso-position-horizontal:absolute;mso-position-horizontal-relative:text;mso-position-vertical:absolute;mso-position-vertical-relative:text" o:gfxdata="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" strokecolor="#4472c4 [3204]" strokeweight=".5pt">
+                <v:stroke endarrow="block" joinstyle="miter"/>
+              </v:shape>
+            </w:pict>
+          </mc:Fallback>
+        </mc:AlternateContent>
+      </w:r>
+      <w:r>
+        <w:rPr>
+          <w:sz w:val="24"/>
+          <w:szCs w:val="24"/>
+        </w:rPr>
+        <w:drawing>
+          <wp:inline distT="0" distB="0" distL="0" distR="0" wp14:anchorId="739A0B72" wp14:editId="35B8EC27">
+            <wp:extent cx="4486901" cy="1543265"/>
+            <wp:effectExtent l="0" t="0" r="9525" b="0"/>
+            <wp:docPr id="177" name="Imagem 177"/>
+            <wp:cNvGraphicFramePr>
+              <a:graphicFrameLocks xmlns:a="http://schemas.openxmlformats.org/drawingml/2006/main" noChangeAspect="1"/>
+            </wp:cNvGraphicFramePr>
+            <a:graphic xmlns:a="http://schemas.openxmlformats.org/drawingml/2006/main">
+              <a:graphicData uri="http://schemas.openxmlformats.org/drawingml/2006/picture">
+                <pic:pic xmlns:pic="http://schemas.openxmlformats.org/drawingml/2006/picture">
+                  <pic:nvPicPr>
+                    <pic:cNvPr id="1" name=""/>
+                    <pic:cNvPicPr/>
+                  </pic:nvPicPr>
+                  <pic:blipFill>
+                    <a:blip r:embed="rId143"/>
+                    <a:stretch>
+                      <a:fillRect/>
+                    </a:stretch>
+                  </pic:blipFill>
+                  <pic:spPr>
+                    <a:xfrm>
+                      <a:off x="0" y="0"/>
+                      <a:ext cx="4486901" cy="1543265"/>
+                    </a:xfrm>
+                    <a:prstGeom prst="rect">
+                      <a:avLst/>
+                    </a:prstGeom>
+                  </pic:spPr>
+                </pic:pic>
+              </a:graphicData>
+            </a:graphic>
+          </wp:inline>
+        </w:drawing>
+      </w:r>
+    </w:p>
+    <w:p>
+      <w:pPr>
+        <w:pStyle w:val="PargrafodaLista"/>
+        <w:tabs>
+          <w:tab w:val="left" w:pos="1275"/>
+        </w:tabs>
+        <w:rPr>
+          <w:sz w:val="24"/>
+          <w:szCs w:val="24"/>
+        </w:rPr>
+      </w:pPr>
+    </w:p>
+    <w:p>
+      <w:pPr>
+        <w:pStyle w:val="PargrafodaLista"/>
+        <w:tabs>
+          <w:tab w:val="left" w:pos="1275"/>
+        </w:tabs>
+        <w:rPr>
+          <w:sz w:val="24"/>
+          <w:szCs w:val="24"/>
+        </w:rPr>
+      </w:pPr>
+    </w:p>
+    <w:p>
+      <w:pPr>
+        <w:pStyle w:val="PargrafodaLista"/>
+        <w:tabs>
+          <w:tab w:val="left" w:pos="1275"/>
+        </w:tabs>
+        <w:rPr>
+          <w:sz w:val="24"/>
+          <w:szCs w:val="24"/>
+        </w:rPr>
+      </w:pPr>
+    </w:p>
+    <w:p>
+      <w:pPr>
+        <w:pStyle w:val="PargrafodaLista"/>
+        <w:tabs>
+          <w:tab w:val="left" w:pos="1275"/>
+        </w:tabs>
+        <w:rPr>
+          <w:sz w:val="24"/>
+          <w:szCs w:val="24"/>
+        </w:rPr>
+      </w:pPr>
+    </w:p>
+    <w:p>
+      <w:pPr>
+        <w:pStyle w:val="PargrafodaLista"/>
+        <w:tabs>
+          <w:tab w:val="left" w:pos="1275"/>
+        </w:tabs>
+        <w:rPr>
+          <w:sz w:val="24"/>
+          <w:szCs w:val="24"/>
+        </w:rPr>
+      </w:pPr>
+      <w:r>
+        <w:rPr>
+          <w:sz w:val="24"/>
+          <w:szCs w:val="24"/>
+        </w:rPr>
+        <w:t xml:space="preserve">94 – Para melhorar  o espalhamento da sombra existe um terceiro </w:t>
+      </w:r>
+      <w:r>
+        <w:rPr>
+          <w:sz w:val="24"/>
+          <w:szCs w:val="24"/>
+        </w:rPr>
+        <w:t xml:space="preserve">elemento chamado </w:t>
+      </w:r>
+      <w:proofErr w:type="spellStart"/>
+      <w:r>
+        <w:rPr>
+          <w:sz w:val="24"/>
+          <w:szCs w:val="24"/>
+        </w:rPr>
+        <w:t>bluer</w:t>
+      </w:r>
+      <w:proofErr w:type="spellEnd"/>
+      <w:r>
+        <w:rPr>
+          <w:sz w:val="24"/>
+          <w:szCs w:val="24"/>
+        </w:rPr>
+        <w:t xml:space="preserve"> que vai do solido para transparente.</w:t>
+      </w:r>
+    </w:p>
+    <w:p>
+      <w:pPr>
+        <w:pStyle w:val="PargrafodaLista"/>
+        <w:tabs>
+          <w:tab w:val="left" w:pos="1275"/>
+        </w:tabs>
+        <w:rPr>
+          <w:sz w:val="24"/>
+          <w:szCs w:val="24"/>
+        </w:rPr>
+      </w:pPr>
+      <w:r>
+        <w:rPr>
+          <w:sz w:val="24"/>
+          <w:szCs w:val="24"/>
+        </w:rPr>
+        <w:drawing>
+          <wp:inline distT="0" distB="0" distL="0" distR="0" wp14:anchorId="05CD2BD6" wp14:editId="79256E6C">
+            <wp:extent cx="4744112" cy="1400370"/>
+            <wp:effectExtent l="0" t="0" r="0" b="9525"/>
+            <wp:docPr id="180" name="Imagem 180"/>
+            <wp:cNvGraphicFramePr>
+              <a:graphicFrameLocks xmlns:a="http://schemas.openxmlformats.org/drawingml/2006/main" noChangeAspect="1"/>
+            </wp:cNvGraphicFramePr>
+            <a:graphic xmlns:a="http://schemas.openxmlformats.org/drawingml/2006/main">
+              <a:graphicData uri="http://schemas.openxmlformats.org/drawingml/2006/picture">
+                <pic:pic xmlns:pic="http://schemas.openxmlformats.org/drawingml/2006/picture">
+                  <pic:nvPicPr>
+                    <pic:cNvPr id="1" name=""/>
+                    <pic:cNvPicPr/>
+                  </pic:nvPicPr>
+                  <pic:blipFill>
+                    <a:blip r:embed="rId144"/>
+                    <a:stretch>
+                      <a:fillRect/>
+                    </a:stretch>
+                  </pic:blipFill>
+                  <pic:spPr>
+                    <a:xfrm>
+                      <a:off x="0" y="0"/>
+                      <a:ext cx="4744112" cy="1400370"/>
+                    </a:xfrm>
+                    <a:prstGeom prst="rect">
+                      <a:avLst/>
+                    </a:prstGeom>
+                  </pic:spPr>
+                </pic:pic>
+              </a:graphicData>
+            </a:graphic>
+          </wp:inline>
+        </w:drawing>
+      </w:r>
+    </w:p>
+    <w:p>
+      <w:pPr>
+        <w:pStyle w:val="PargrafodaLista"/>
+        <w:tabs>
+          <w:tab w:val="left" w:pos="1275"/>
+        </w:tabs>
+        <w:rPr>
+          <w:sz w:val="24"/>
+          <w:szCs w:val="24"/>
+        </w:rPr>
+      </w:pPr>
+    </w:p>
+    <w:p>
+      <w:pPr>
+        <w:pStyle w:val="PargrafodaLista"/>
+        <w:tabs>
+          <w:tab w:val="left" w:pos="1275"/>
+        </w:tabs>
+        <w:rPr>
+          <w:sz w:val="24"/>
+          <w:szCs w:val="24"/>
+        </w:rPr>
+      </w:pPr>
+    </w:p>
+    <w:p>
+      <w:pPr>
+        <w:pStyle w:val="PargrafodaLista"/>
+        <w:tabs>
+          <w:tab w:val="left" w:pos="1275"/>
+        </w:tabs>
+        <w:rPr>
+          <w:sz w:val="24"/>
+          <w:szCs w:val="24"/>
+        </w:rPr>
+      </w:pPr>
+      <w:r>
+        <w:rPr>
+          <w:sz w:val="24"/>
+          <w:szCs w:val="24"/>
+        </w:rPr>
+        <w:t xml:space="preserve">95- </w:t>
+      </w:r>
+      <w:r>
+        <w:rPr>
+          <w:sz w:val="24"/>
+          <w:szCs w:val="24"/>
+        </w:rPr>
+        <w:t>Temos ainda a quarta propriedade que configura a intensidade da borda a partir do tamanho do elemento, isto é, o tamanho da sombr</w:t>
+      </w:r>
+      <w:r>
+        <w:rPr>
+          <w:sz w:val="24"/>
+          <w:szCs w:val="24"/>
+        </w:rPr>
+        <w:t>a projetada.</w:t>
+      </w:r>
+    </w:p>
+    <w:p>
+      <w:pPr>
+        <w:pStyle w:val="PargrafodaLista"/>
+        <w:tabs>
+          <w:tab w:val="left" w:pos="1275"/>
+        </w:tabs>
+        <w:rPr>
+          <w:sz w:val="24"/>
+          <w:szCs w:val="24"/>
+        </w:rPr>
+      </w:pPr>
+    </w:p>
+    <w:p>
+      <w:pPr>
+        <w:pStyle w:val="PargrafodaLista"/>
+        <w:tabs>
+          <w:tab w:val="left" w:pos="1275"/>
+        </w:tabs>
+        <w:rPr>
+          <w:sz w:val="24"/>
+          <w:szCs w:val="24"/>
+        </w:rPr>
+      </w:pPr>
+    </w:p>
+    <w:p>
+      <w:pPr>
+        <w:pStyle w:val="PargrafodaLista"/>
+        <w:tabs>
+          <w:tab w:val="left" w:pos="1275"/>
+        </w:tabs>
+        <w:rPr>
+          <w:sz w:val="24"/>
+          <w:szCs w:val="24"/>
+        </w:rPr>
+      </w:pPr>
+    </w:p>
+    <w:p>
+      <w:pPr>
+        <w:pStyle w:val="PargrafodaLista"/>
+        <w:tabs>
+          <w:tab w:val="left" w:pos="1275"/>
+        </w:tabs>
+        <w:rPr>
+          <w:sz w:val="24"/>
+          <w:szCs w:val="24"/>
+        </w:rPr>
+      </w:pPr>
+      <w:r>
+        <w:rPr>
+          <w:sz w:val="24"/>
+          <w:szCs w:val="24"/>
+        </w:rPr>
+        <w:drawing>
+          <wp:inline distT="0" distB="0" distL="0" distR="0" wp14:anchorId="7E63D212" wp14:editId="7909C3C7">
+            <wp:extent cx="5400040" cy="1641475"/>
+            <wp:effectExtent l="0" t="0" r="0" b="0"/>
+            <wp:docPr id="181" name="Imagem 181"/>
+            <wp:cNvGraphicFramePr>
+              <a:graphicFrameLocks xmlns:a="http://schemas.openxmlformats.org/drawingml/2006/main" noChangeAspect="1"/>
+            </wp:cNvGraphicFramePr>
+            <a:graphic xmlns:a="http://schemas.openxmlformats.org/drawingml/2006/main">
+              <a:graphicData uri="http://schemas.openxmlformats.org/drawingml/2006/picture">
+                <pic:pic xmlns:pic="http://schemas.openxmlformats.org/drawingml/2006/picture">
+                  <pic:nvPicPr>
+                    <pic:cNvPr id="1" name=""/>
+                    <pic:cNvPicPr/>
+                  </pic:nvPicPr>
+                  <pic:blipFill>
+                    <a:blip r:embed="rId145"/>
+                    <a:stretch>
+                      <a:fillRect/>
+                    </a:stretch>
+                  </pic:blipFill>
+                  <pic:spPr>
+                    <a:xfrm>
+                      <a:off x="0" y="0"/>
+                      <a:ext cx="5400040" cy="1641475"/>
+                    </a:xfrm>
+                    <a:prstGeom prst="rect">
+                      <a:avLst/>
+                    </a:prstGeom>
+                  </pic:spPr>
+                </pic:pic>
+              </a:graphicData>
+            </a:graphic>
+          </wp:inline>
+        </w:drawing>
+      </w:r>
+    </w:p>
+    <w:p>
+      <w:pPr>
+        <w:pStyle w:val="PargrafodaLista"/>
+        <w:tabs>
+          <w:tab w:val="left" w:pos="1275"/>
+        </w:tabs>
+        <w:rPr>
+          <w:sz w:val="24"/>
+          <w:szCs w:val="24"/>
+        </w:rPr>
+      </w:pPr>
+    </w:p>
+    <w:p>
+      <w:pPr>
+        <w:pStyle w:val="PargrafodaLista"/>
+        <w:tabs>
+          <w:tab w:val="left" w:pos="1275"/>
+        </w:tabs>
+        <w:rPr>
+          <w:sz w:val="24"/>
+          <w:szCs w:val="24"/>
+        </w:rPr>
+      </w:pPr>
+    </w:p>
+    <w:p>
+      <w:pPr>
+        <w:pStyle w:val="PargrafodaLista"/>
+        <w:tabs>
+          <w:tab w:val="left" w:pos="1275"/>
+        </w:tabs>
+        <w:rPr>
+          <w:sz w:val="24"/>
+          <w:szCs w:val="24"/>
+        </w:rPr>
+      </w:pPr>
+      <w:r>
+        <w:rPr>
+          <w:sz w:val="24"/>
+          <w:szCs w:val="24"/>
+        </w:rPr>
+        <w:t>96- Design Responsivo</w:t>
+      </w:r>
+    </w:p>
+    <w:p>
+      <w:pPr>
+        <w:pStyle w:val="PargrafodaLista"/>
+        <w:tabs>
+          <w:tab w:val="left" w:pos="1275"/>
+        </w:tabs>
+        <w:rPr>
+          <w:sz w:val="24"/>
+          <w:szCs w:val="24"/>
+        </w:rPr>
+      </w:pPr>
+    </w:p>
+    <w:p>
+      <w:pPr>
+        <w:pStyle w:val="PargrafodaLista"/>
+        <w:tabs>
+          <w:tab w:val="left" w:pos="1275"/>
+        </w:tabs>
+        <w:rPr>
+          <w:sz w:val="24"/>
+          <w:szCs w:val="24"/>
+        </w:rPr>
+      </w:pPr>
+      <w:r>
+        <w:rPr>
+          <w:sz w:val="24"/>
+          <w:szCs w:val="24"/>
+        </w:rPr>
+        <w:t xml:space="preserve">O que podemos fazer para saber se a nossa </w:t>
+      </w:r>
+      <w:r>
+        <w:rPr>
+          <w:sz w:val="24"/>
+          <w:szCs w:val="24"/>
+        </w:rPr>
+        <w:t>página</w:t>
+      </w:r>
+      <w:r>
+        <w:rPr>
+          <w:sz w:val="24"/>
+          <w:szCs w:val="24"/>
+        </w:rPr>
+        <w:t xml:space="preserve"> </w:t>
+      </w:r>
+      <w:r>
+        <w:rPr>
+          <w:sz w:val="24"/>
+          <w:szCs w:val="24"/>
+        </w:rPr>
+        <w:t>está</w:t>
+      </w:r>
+      <w:r>
+        <w:rPr>
+          <w:sz w:val="24"/>
+          <w:szCs w:val="24"/>
+        </w:rPr>
+        <w:t xml:space="preserve"> adaptada </w:t>
+      </w:r>
+      <w:r>
+        <w:rPr>
+          <w:sz w:val="24"/>
+          <w:szCs w:val="24"/>
+        </w:rPr>
+        <w:t>para uso de celular?</w:t>
+      </w:r>
+      <w:r>
+        <w:rPr>
+          <w:sz w:val="24"/>
+          <w:szCs w:val="24"/>
+        </w:rPr>
+        <w:t xml:space="preserve"> </w:t>
+      </w:r>
+    </w:p>
+    <w:p>
+      <w:pPr>
+        <w:pStyle w:val="PargrafodaLista"/>
+        <w:tabs>
+          <w:tab w:val="left" w:pos="1275"/>
+        </w:tabs>
+        <w:rPr>
+          <w:sz w:val="24"/>
+          <w:szCs w:val="24"/>
+        </w:rPr>
+      </w:pPr>
+      <w:r>
+        <w:rPr>
+          <w:sz w:val="24"/>
+          <w:szCs w:val="24"/>
+        </w:rPr>
+        <w:t xml:space="preserve">Tem duas formas de abrir e verificar  a ferramenta do desenvolvedor </w:t>
+      </w:r>
+      <w:r>
+        <w:rPr>
+          <w:sz w:val="24"/>
+          <w:szCs w:val="24"/>
+        </w:rPr>
+        <w:t>onde observamos se o site esta ou não para o celular.</w:t>
+      </w:r>
+    </w:p>
+    <w:p>
+      <w:pPr>
+        <w:pStyle w:val="PargrafodaLista"/>
+        <w:tabs>
+          <w:tab w:val="left" w:pos="1275"/>
+        </w:tabs>
+        <w:rPr>
+          <w:sz w:val="24"/>
+          <w:szCs w:val="24"/>
+        </w:rPr>
+      </w:pPr>
+    </w:p>
+    <w:p>
+      <w:pPr>
+        <w:pStyle w:val="PargrafodaLista"/>
+        <w:tabs>
+          <w:tab w:val="left" w:pos="1275"/>
+        </w:tabs>
+        <w:rPr>
+          <w:sz w:val="24"/>
+          <w:szCs w:val="24"/>
+        </w:rPr>
+      </w:pPr>
+      <w:r>
+        <w:rPr>
+          <w:sz w:val="24"/>
+          <w:szCs w:val="24"/>
+        </w:rPr>
+        <w:t xml:space="preserve">1 – </w:t>
+      </w:r>
+      <w:proofErr w:type="spellStart"/>
+      <w:proofErr w:type="gramStart"/>
+      <w:r>
+        <w:rPr>
+          <w:sz w:val="24"/>
+          <w:szCs w:val="24"/>
+        </w:rPr>
+        <w:t>contr</w:t>
+      </w:r>
+      <w:proofErr w:type="spellEnd"/>
+      <w:proofErr w:type="gramEnd"/>
+      <w:r>
+        <w:rPr>
+          <w:sz w:val="24"/>
+          <w:szCs w:val="24"/>
+        </w:rPr>
+        <w:t xml:space="preserve"> + shift + i</w:t>
+      </w:r>
+    </w:p>
+    <w:p>
+      <w:pPr>
+        <w:pStyle w:val="PargrafodaLista"/>
+        <w:numPr>
+          <w:ilvl w:val="0"/>
+          <w:numId w:val="5"/>
+        </w:numPr>
+        <w:tabs>
+          <w:tab w:val="left" w:pos="1275"/>
+        </w:tabs>
+        <w:rPr>
+          <w:sz w:val="24"/>
+          <w:szCs w:val="24"/>
+        </w:rPr>
+      </w:pPr>
+      <w:r>
+        <w:rPr>
+          <w:sz w:val="24"/>
+          <w:szCs w:val="24"/>
+        </w:rPr>
+        <w:t>F12</w:t>
+      </w:r>
+    </w:p>
+    <w:p>
+      <w:pPr>
+        <w:pStyle w:val="PargrafodaLista"/>
+        <w:tabs>
+          <w:tab w:val="left" w:pos="1275"/>
+        </w:tabs>
+        <w:ind w:left="1080"/>
+        <w:rPr>
+          <w:sz w:val="24"/>
+          <w:szCs w:val="24"/>
+        </w:rPr>
+      </w:pPr>
+    </w:p>
+    <w:p>
+      <w:pPr>
+        <w:pStyle w:val="PargrafodaLista"/>
+        <w:tabs>
+          <w:tab w:val="left" w:pos="1275"/>
+        </w:tabs>
+        <w:ind w:left="1080"/>
+        <w:rPr>
+          <w:sz w:val="24"/>
+          <w:szCs w:val="24"/>
+        </w:rPr>
+      </w:pPr>
       <w:bookmarkStart w:id="0" w:name="_GoBack"/>
+      <w:r>
+        <w:rPr>
+          <w:noProof/>
+          <w:sz w:val="24"/>
+          <w:szCs w:val="24"/>
+        </w:rPr>
+        <w:lastRenderedPageBreak/>
+        <mc:AlternateContent>
+          <mc:Choice Requires="wps">
+            <w:drawing>
+              <wp:anchor distT="0" distB="0" distL="114300" distR="114300" simplePos="0" relativeHeight="251705344" behindDoc="0" locked="0" layoutInCell="1" allowOverlap="1">
+                <wp:simplePos x="0" y="0"/>
+                <wp:positionH relativeFrom="column">
+                  <wp:posOffset>3593465</wp:posOffset>
+                </wp:positionH>
+                <wp:positionV relativeFrom="paragraph">
+                  <wp:posOffset>-829945</wp:posOffset>
+                </wp:positionV>
+                <wp:extent cx="323850" cy="908050"/>
+                <wp:effectExtent l="38100" t="0" r="19050" b="63500"/>
+                <wp:wrapNone/>
+                <wp:docPr id="185" name="Conector de Seta Reta 185"/>
+                <wp:cNvGraphicFramePr/>
+                <a:graphic xmlns:a="http://schemas.openxmlformats.org/drawingml/2006/main">
+                  <a:graphicData uri="http://schemas.microsoft.com/office/word/2010/wordprocessingShape">
+                    <wps:wsp>
+                      <wps:cNvCnPr/>
+                      <wps:spPr>
+                        <a:xfrm flipH="1">
+                          <a:off x="0" y="0"/>
+                          <a:ext cx="323850" cy="908050"/>
+                        </a:xfrm>
+                        <a:prstGeom prst="straightConnector1">
+                          <a:avLst/>
+                        </a:prstGeom>
+                        <a:ln>
+                          <a:tailEnd type="triangle"/>
+                        </a:ln>
+                      </wps:spPr>
+                      <wps:style>
+                        <a:lnRef idx="1">
+                          <a:schemeClr val="accent1"/>
+                        </a:lnRef>
+                        <a:fillRef idx="0">
+                          <a:schemeClr val="accent1"/>
+                        </a:fillRef>
+                        <a:effectRef idx="0">
+                          <a:schemeClr val="accent1"/>
+                        </a:effectRef>
+                        <a:fontRef idx="minor">
+                          <a:schemeClr val="tx1"/>
+                        </a:fontRef>
+                      </wps:style>
+                      <wps:bodyPr/>
+                    </wps:wsp>
+                  </a:graphicData>
+                </a:graphic>
+              </wp:anchor>
+            </w:drawing>
+          </mc:Choice>
+          <mc:Fallback>
+            <w:pict>
+              <v:shape w14:anchorId="4E8DA599" id="Conector de Seta Reta 185" o:spid="_x0000_s1026" type="#_x0000_t32" style="position:absolute;margin-left:282.95pt;margin-top:-65.35pt;width:25.5pt;height:71.5pt;flip:x;z-index:251705344;visibility:visible;mso-wrap-style:square;mso-wrap-distance-left:9pt;mso-wrap-distance-top:0;mso-wrap-distance-right:9pt;mso-wrap-distance-bottom:0;mso-position-horizontal:absolute;mso-position-horizontal-relative:text;mso-position-vertical:absolute;mso-position-vertical-relative:text" o:gfxdata="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" strokecolor="#4472c4 [3204]" strokeweight=".5pt">
+                <v:stroke endarrow="block" joinstyle="miter"/>
+              </v:shape>
+            </w:pict>
+          </mc:Fallback>
+        </mc:AlternateContent>
+      </w:r>
       <w:bookmarkEnd w:id="0"/>
+      <w:r>
+        <w:rPr>
+          <w:sz w:val="24"/>
+          <w:szCs w:val="24"/>
+        </w:rPr>
+        <w:drawing>
+          <wp:inline distT="0" distB="0" distL="0" distR="0" wp14:anchorId="08368810" wp14:editId="7C3A0033">
+            <wp:extent cx="5400040" cy="2395220"/>
+            <wp:effectExtent l="0" t="0" r="0" b="5080"/>
+            <wp:docPr id="182" name="Imagem 182"/>
+            <wp:cNvGraphicFramePr>
+              <a:graphicFrameLocks xmlns:a="http://schemas.openxmlformats.org/drawingml/2006/main" noChangeAspect="1"/>
+            </wp:cNvGraphicFramePr>
+            <a:graphic xmlns:a="http://schemas.openxmlformats.org/drawingml/2006/main">
+              <a:graphicData uri="http://schemas.openxmlformats.org/drawingml/2006/picture">
+                <pic:pic xmlns:pic="http://schemas.openxmlformats.org/drawingml/2006/picture">
+                  <pic:nvPicPr>
+                    <pic:cNvPr id="1" name=""/>
+                    <pic:cNvPicPr/>
+                  </pic:nvPicPr>
+                  <pic:blipFill>
+                    <a:blip r:embed="rId146"/>
+                    <a:stretch>
+                      <a:fillRect/>
+                    </a:stretch>
+                  </pic:blipFill>
+                  <pic:spPr>
+                    <a:xfrm>
+                      <a:off x="0" y="0"/>
+                      <a:ext cx="5400040" cy="2395220"/>
+                    </a:xfrm>
+                    <a:prstGeom prst="rect">
+                      <a:avLst/>
+                    </a:prstGeom>
+                  </pic:spPr>
+                </pic:pic>
+              </a:graphicData>
+            </a:graphic>
+          </wp:inline>
+        </w:drawing>
+      </w:r>
     </w:p>
     <w:sectPr>
       <w:pgSz w:w="11906" w:h="16838"/>
@@ -19365,6 +21968,95 @@
       </w:rPr>
     </w:lvl>
   </w:abstractNum>
+  <w:abstractNum w:abstractNumId="4" w15:restartNumberingAfterBreak="0">
+    <w:nsid w:val="7548119C"/>
+    <w:multiLevelType w:val="hybridMultilevel"/>
+    <w:tmpl w:val="4FF4C2FC"/>
+    <w:lvl w:ilvl="0" w:tplc="32900BF6">
+      <w:start w:val="1"/>
+      <w:numFmt w:val="decimal"/>
+      <w:lvlText w:val="%1-"/>
+      <w:lvlJc w:val="left"/>
+      <w:pPr>
+        <w:ind w:left="1080" w:hanging="360"/>
+      </w:pPr>
+      <w:rPr>
+        <w:rFonts w:hint="default"/>
+      </w:rPr>
+    </w:lvl>
+    <w:lvl w:ilvl="1" w:tplc="04160019" w:tentative="1">
+      <w:start w:val="1"/>
+      <w:numFmt w:val="lowerLetter"/>
+      <w:lvlText w:val="%2."/>
+      <w:lvlJc w:val="left"/>
+      <w:pPr>
+        <w:ind w:left="1800" w:hanging="360"/>
+      </w:pPr>
+    </w:lvl>
+    <w:lvl w:ilvl="2" w:tplc="0416001B" w:tentative="1">
+      <w:start w:val="1"/>
+      <w:numFmt w:val="lowerRoman"/>
+      <w:lvlText w:val="%3."/>
+      <w:lvlJc w:val="right"/>
+      <w:pPr>
+        <w:ind w:left="2520" w:hanging="180"/>
+      </w:pPr>
+    </w:lvl>
+    <w:lvl w:ilvl="3" w:tplc="0416000F" w:tentative="1">
+      <w:start w:val="1"/>
+      <w:numFmt w:val="decimal"/>
+      <w:lvlText w:val="%4."/>
+      <w:lvlJc w:val="left"/>
+      <w:pPr>
+        <w:ind w:left="3240" w:hanging="360"/>
+      </w:pPr>
+    </w:lvl>
+    <w:lvl w:ilvl="4" w:tplc="04160019" w:tentative="1">
+      <w:start w:val="1"/>
+      <w:numFmt w:val="lowerLetter"/>
+      <w:lvlText w:val="%5."/>
+      <w:lvlJc w:val="left"/>
+      <w:pPr>
+        <w:ind w:left="3960" w:hanging="360"/>
+      </w:pPr>
+    </w:lvl>
+    <w:lvl w:ilvl="5" w:tplc="0416001B" w:tentative="1">
+      <w:start w:val="1"/>
+      <w:numFmt w:val="lowerRoman"/>
+      <w:lvlText w:val="%6."/>
+      <w:lvlJc w:val="right"/>
+      <w:pPr>
+        <w:ind w:left="4680" w:hanging="180"/>
+      </w:pPr>
+    </w:lvl>
+    <w:lvl w:ilvl="6" w:tplc="0416000F" w:tentative="1">
+      <w:start w:val="1"/>
+      <w:numFmt w:val="decimal"/>
+      <w:lvlText w:val="%7."/>
+      <w:lvlJc w:val="left"/>
+      <w:pPr>
+        <w:ind w:left="5400" w:hanging="360"/>
+      </w:pPr>
+    </w:lvl>
+    <w:lvl w:ilvl="7" w:tplc="04160019" w:tentative="1">
+      <w:start w:val="1"/>
+      <w:numFmt w:val="lowerLetter"/>
+      <w:lvlText w:val="%8."/>
+      <w:lvlJc w:val="left"/>
+      <w:pPr>
+        <w:ind w:left="6120" w:hanging="360"/>
+      </w:pPr>
+    </w:lvl>
+    <w:lvl w:ilvl="8" w:tplc="0416001B" w:tentative="1">
+      <w:start w:val="1"/>
+      <w:numFmt w:val="lowerRoman"/>
+      <w:lvlText w:val="%9."/>
+      <w:lvlJc w:val="right"/>
+      <w:pPr>
+        <w:ind w:left="6840" w:hanging="180"/>
+      </w:pPr>
+    </w:lvl>
+  </w:abstractNum>
   <w:num w:numId="1">
     <w:abstractNumId w:val="3"/>
   </w:num>
@@ -19376,6 +22068,9 @@
   </w:num>
   <w:num w:numId="4">
     <w:abstractNumId w:val="2"/>
+  </w:num>
+  <w:num w:numId="5">
+    <w:abstractNumId w:val="4"/>
   </w:num>
 </w:numbering>
 </file>
@@ -20247,7 +22942,7 @@
 </file>
 
 <file path=customXml/itemProps1.xml><?xml version="1.0" encoding="utf-8"?>
-<ds:datastoreItem xmlns:ds="http://schemas.openxmlformats.org/officeDocument/2006/customXml" ds:itemID="{626459D5-1C0A-49E7-8E50-7FAF20AC32DD}">
+<ds:datastoreItem xmlns:ds="http://schemas.openxmlformats.org/officeDocument/2006/customXml" ds:itemID="{94C094A2-F690-4923-BCC9-28E500FF6BDC}">
   <ds:schemaRefs>
     <ds:schemaRef ds:uri="http://schemas.openxmlformats.org/officeDocument/2006/bibliography"/>
   </ds:schemaRefs>

</xml_diff>